<commit_message>
Redid the colors for the entire site
</commit_message>
<xml_diff>
--- a/other/Gala eksāmens.docx
+++ b/other/Gala eksāmens.docx
@@ -1,6 +1,6 @@
 
 <file path=word/document.xml><?xml version="1.0" encoding="utf-8"?>
-<w:document xmlns:wpc="http://schemas.microsoft.com/office/word/2010/wordprocessingCanvas" xmlns:cx="http://schemas.microsoft.com/office/drawing/2014/chartex" xmlns:cx1="http://schemas.microsoft.com/office/drawing/2015/9/8/chartex" xmlns:cx2="http://schemas.microsoft.com/office/drawing/2015/10/21/chartex" xmlns:cx3="http://schemas.microsoft.com/office/drawing/2016/5/9/chartex" xmlns:cx4="http://schemas.microsoft.com/office/drawing/2016/5/10/chartex" xmlns:cx5="http://schemas.microsoft.com/office/drawing/2016/5/11/chartex" xmlns:cx6="http://schemas.microsoft.com/office/drawing/2016/5/12/chartex" xmlns:cx7="http://schemas.microsoft.com/office/drawing/2016/5/13/chartex" xmlns:cx8="http://schemas.microsoft.com/office/drawing/2016/5/14/chartex" xmlns:mc="http://schemas.openxmlformats.org/markup-compatibility/2006" xmlns:aink="http://schemas.microsoft.com/office/drawing/2016/ink" xmlns:am3d="http://schemas.microsoft.com/office/drawing/2017/model3d" xmlns:o="urn:schemas-microsoft-com:office:office" xmlns:oel="http://schemas.microsoft.com/office/2019/extlst" xmlns:r="http://schemas.openxmlformats.org/officeDocument/2006/relationships" xmlns:m="http://schemas.openxmlformats.org/officeDocument/2006/math" xmlns:v="urn:schemas-microsoft-com:vml" xmlns:wp14="http://schemas.microsoft.com/office/word/2010/wordprocessingDrawing" xmlns:wp="http://schemas.openxmlformats.org/drawingml/2006/wordprocessingDrawing" xmlns:w10="urn:schemas-microsoft-com:office:word" xmlns:w="http://schemas.openxmlformats.org/wordprocessingml/2006/main" xmlns:w14="http://schemas.microsoft.com/office/word/2010/wordml" xmlns:w15="http://schemas.microsoft.com/office/word/2012/wordml" xmlns:w16cex="http://schemas.microsoft.com/office/word/2018/wordml/cex" xmlns:w16cid="http://schemas.microsoft.com/office/word/2016/wordml/cid" xmlns:w16="http://schemas.microsoft.com/office/word/2018/wordml" xmlns:w16sdtdh="http://schemas.microsoft.com/office/word/2020/wordml/sdtdatahash" xmlns:w16se="http://schemas.microsoft.com/office/word/2015/wordml/symex" xmlns:wpg="http://schemas.microsoft.com/office/word/2010/wordprocessingGroup" xmlns:wpi="http://schemas.microsoft.com/office/word/2010/wordprocessingInk" xmlns:wne="http://schemas.microsoft.com/office/word/2006/wordml" xmlns:wps="http://schemas.microsoft.com/office/word/2010/wordprocessingShape" mc:Ignorable="w14 w15 w16se w16cid w16 w16cex w16sdtdh wp14">
+<w:document xmlns:wpc="http://schemas.microsoft.com/office/word/2010/wordprocessingCanvas" xmlns:cx="http://schemas.microsoft.com/office/drawing/2014/chartex" xmlns:cx1="http://schemas.microsoft.com/office/drawing/2015/9/8/chartex" xmlns:cx2="http://schemas.microsoft.com/office/drawing/2015/10/21/chartex" xmlns:cx3="http://schemas.microsoft.com/office/drawing/2016/5/9/chartex" xmlns:cx4="http://schemas.microsoft.com/office/drawing/2016/5/10/chartex" xmlns:cx5="http://schemas.microsoft.com/office/drawing/2016/5/11/chartex" xmlns:cx6="http://schemas.microsoft.com/office/drawing/2016/5/12/chartex" xmlns:cx7="http://schemas.microsoft.com/office/drawing/2016/5/13/chartex" xmlns:cx8="http://schemas.microsoft.com/office/drawing/2016/5/14/chartex" xmlns:mc="http://schemas.openxmlformats.org/markup-compatibility/2006" xmlns:aink="http://schemas.microsoft.com/office/drawing/2016/ink" xmlns:am3d="http://schemas.microsoft.com/office/drawing/2017/model3d" xmlns:o="urn:schemas-microsoft-com:office:office" xmlns:r="http://schemas.openxmlformats.org/officeDocument/2006/relationships" xmlns:m="http://schemas.openxmlformats.org/officeDocument/2006/math" xmlns:v="urn:schemas-microsoft-com:vml" xmlns:wp14="http://schemas.microsoft.com/office/word/2010/wordprocessingDrawing" xmlns:wp="http://schemas.openxmlformats.org/drawingml/2006/wordprocessingDrawing" xmlns:w10="urn:schemas-microsoft-com:office:word" xmlns:w="http://schemas.openxmlformats.org/wordprocessingml/2006/main" xmlns:w14="http://schemas.microsoft.com/office/word/2010/wordml" xmlns:w15="http://schemas.microsoft.com/office/word/2012/wordml" xmlns:w16cex="http://schemas.microsoft.com/office/word/2018/wordml/cex" xmlns:w16cid="http://schemas.microsoft.com/office/word/2016/wordml/cid" xmlns:w16="http://schemas.microsoft.com/office/word/2018/wordml" xmlns:w16sdtdh="http://schemas.microsoft.com/office/word/2020/wordml/sdtdatahash" xmlns:w16se="http://schemas.microsoft.com/office/word/2015/wordml/symex" xmlns:wpg="http://schemas.microsoft.com/office/word/2010/wordprocessingGroup" xmlns:wpi="http://schemas.microsoft.com/office/word/2010/wordprocessingInk" xmlns:wne="http://schemas.microsoft.com/office/word/2006/wordml" xmlns:wps="http://schemas.microsoft.com/office/word/2010/wordprocessingShape" mc:Ignorable="w14 w15 w16se w16cid w16 w16cex w16sdtdh wp14">
   <w:body>
     <w:p>
       <w:pPr>
@@ -58,6 +58,9 @@
       <w:r>
         <w:t>Liepājas Valsts tehnikums</w:t>
       </w:r>
+      <w:r>
+        <w:tab/>
+      </w:r>
     </w:p>
     <w:p>
       <w:pPr>
@@ -96,7 +99,6 @@
         </w:rPr>
         <w:t>ietne “</w:t>
       </w:r>
-      <w:proofErr w:type="spellStart"/>
       <w:r>
         <w:rPr>
           <w:b/>
@@ -106,7 +108,6 @@
         </w:rPr>
         <w:t>Budgetiva</w:t>
       </w:r>
-      <w:proofErr w:type="spellEnd"/>
       <w:r>
         <w:rPr>
           <w:b/>
@@ -138,13 +139,8 @@
         <w:br/>
       </w:r>
       <w:r>
-        <w:t xml:space="preserve">Dagnis </w:t>
-      </w:r>
-      <w:proofErr w:type="spellStart"/>
-      <w:r>
-        <w:t>Janeks</w:t>
-      </w:r>
-      <w:proofErr w:type="spellEnd"/>
+        <w:t>Dagnis Janeks</w:t>
+      </w:r>
     </w:p>
     <w:p>
       <w:pPr>
@@ -2370,15 +2366,7 @@
     </w:p>
     <w:p>
       <w:r>
-        <w:t xml:space="preserve">Īpaša uzmanība tiks pievērsta datu drošībai un lietotāja privātumam, nodrošinot, ka visa informācija tiek glabāta droši un nav pieejama nepiederošām personām. Sistēmas izstrāde ietvers prasību analīzi, datubāzes struktūras izveidi, lietotāja </w:t>
-      </w:r>
-      <w:proofErr w:type="spellStart"/>
-      <w:r>
-        <w:t>saskarnes</w:t>
-      </w:r>
-      <w:proofErr w:type="spellEnd"/>
-      <w:r>
-        <w:t xml:space="preserve"> plānošanu un programmēšanu, kā arī testēšanu, lai nodrošinātu tās stabilu darbību. Projekta īstenošanas rezultātā tiks izveidota pilnvērtīga tīmekļa sistēma, kas palīdzēs lietotājiem pārvaldīt savas finanses efektīvi un pārskatāmi, veicinot labākus budžeta plānošanas paradumus. Turklāt šī sistēma kalpos kā pamats turpmākai attīstībai, to varēs papildināt ar jaunām iespējām, piemēram, datu sinhronizāciju ar bankas kontiem, investīciju uzskaiti vai finanšu mērķu plānošanu. </w:t>
+        <w:t xml:space="preserve">Īpaša uzmanība tiks pievērsta datu drošībai un lietotāja privātumam, nodrošinot, ka visa informācija tiek glabāta droši un nav pieejama nepiederošām personām. Sistēmas izstrāde ietvers prasību analīzi, datubāzes struktūras izveidi, lietotāja saskarnes plānošanu un programmēšanu, kā arī testēšanu, lai nodrošinātu tās stabilu darbību. Projekta īstenošanas rezultātā tiks izveidota pilnvērtīga tīmekļa sistēma, kas palīdzēs lietotājiem pārvaldīt savas finanses efektīvi un pārskatāmi, veicinot labākus budžeta plānošanas paradumus. Turklāt šī sistēma kalpos kā pamats turpmākai attīstībai, to varēs papildināt ar jaunām iespējām, piemēram, datu sinhronizāciju ar bankas kontiem, investīciju uzskaiti vai finanšu mērķu plānošanu. </w:t>
       </w:r>
     </w:p>
     <w:p>
@@ -2430,41 +2418,17 @@
     </w:p>
     <w:p>
       <w:r>
-        <w:t xml:space="preserve">Sistēma darbosies pārlūkprogrammā, tāpēc lietotāji varēs tai piekļūt no jebkuras ierīces ar interneta </w:t>
-      </w:r>
-      <w:proofErr w:type="spellStart"/>
-      <w:r>
-        <w:t>pieslēgumu</w:t>
-      </w:r>
-      <w:proofErr w:type="spellEnd"/>
-      <w:r>
-        <w:t>. Tās arhitektūra būs veidota modulāri, lai nodrošinātu vieglu uzturēšanu, mērogojamību un iespēju nākotnē pievienot jaunas funkcijas, piemēram, datu sinhronizāciju ar banku kontiem vai finanšu mērķu izsekošanu.</w:t>
-      </w:r>
-    </w:p>
-    <w:p>
-      <w:r>
-        <w:t xml:space="preserve">Produkts būs orientēts uz gala lietotāju – cilvēku, kurš vēlas uzlabot savu finanšu pārvaldību, iegūt pārskatāmu budžeta struktūru un analizēt tēriņu paradumus. Lietotāja </w:t>
-      </w:r>
-      <w:proofErr w:type="spellStart"/>
-      <w:r>
-        <w:t>saskarne</w:t>
-      </w:r>
-      <w:proofErr w:type="spellEnd"/>
-      <w:r>
-        <w:t xml:space="preserve"> tiks veidota intuitīvi, ar skaidru navigāciju un vizuāliem pārskatiem, lai nodrošinātu pozitīvu lietošanas pieredzi.</w:t>
-      </w:r>
-    </w:p>
-    <w:p>
-      <w:r>
-        <w:t xml:space="preserve">No tehniskā viedokļa sistēma ietvers datubāzi datu glabāšanai, lietotāja autentifikācijas moduli drošai piekļuvei un datu šifrēšanu, lai aizsargātu </w:t>
-      </w:r>
-      <w:proofErr w:type="spellStart"/>
-      <w:r>
-        <w:t>sensitīvu</w:t>
-      </w:r>
-      <w:proofErr w:type="spellEnd"/>
-      <w:r>
-        <w:t xml:space="preserve"> informāciju. Turklāt tā būs savietojama ar modernākajām tīmekļa tehnoloģijām, nodrošinot stabilu un ātru darbību.</w:t>
+        <w:t>Sistēma darbosies pārlūkprogrammā, tāpēc lietotāji varēs tai piekļūt no jebkuras ierīces ar interneta pieslēgumu. Tās arhitektūra būs veidota modulāri, lai nodrošinātu vieglu uzturēšanu, mērogojamību un iespēju nākotnē pievienot jaunas funkcijas, piemēram, datu sinhronizāciju ar banku kontiem vai finanšu mērķu izsekošanu.</w:t>
+      </w:r>
+    </w:p>
+    <w:p>
+      <w:r>
+        <w:t>Produkts būs orientēts uz gala lietotāju – cilvēku, kurš vēlas uzlabot savu finanšu pārvaldību, iegūt pārskatāmu budžeta struktūru un analizēt tēriņu paradumus. Lietotāja saskarne tiks veidota intuitīvi, ar skaidru navigāciju un vizuāliem pārskatiem, lai nodrošinātu pozitīvu lietošanas pieredzi.</w:t>
+      </w:r>
+    </w:p>
+    <w:p>
+      <w:r>
+        <w:t>No tehniskā viedokļa sistēma ietvers datubāzi datu glabāšanai, lietotāja autentifikācijas moduli drošai piekļuvei un datu šifrēšanu, lai aizsargātu sensitīvu informāciju. Turklāt tā būs savietojama ar modernākajām tīmekļa tehnoloģijām, nodrošinot stabilu un ātru darbību.</w:t>
       </w:r>
     </w:p>
     <w:p>
@@ -2554,23 +2518,13 @@
           <w:u w:val="single"/>
         </w:rPr>
       </w:pPr>
-      <w:proofErr w:type="spellStart"/>
       <w:r>
         <w:rPr>
           <w:b/>
           <w:bCs/>
           <w:u w:val="single"/>
         </w:rPr>
-        <w:t>Ievaddati</w:t>
-      </w:r>
-      <w:proofErr w:type="spellEnd"/>
-      <w:r>
-        <w:rPr>
-          <w:b/>
-          <w:bCs/>
-          <w:u w:val="single"/>
-        </w:rPr>
-        <w:t>:</w:t>
+        <w:t>Ievaddati:</w:t>
       </w:r>
     </w:p>
     <w:p>
@@ -2616,17 +2570,8 @@
           <w:b/>
           <w:bCs/>
         </w:rPr>
-        <w:t xml:space="preserve">Reģistrācijas </w:t>
-      </w:r>
-      <w:proofErr w:type="spellStart"/>
-      <w:r>
-        <w:rPr>
-          <w:b/>
-          <w:bCs/>
-        </w:rPr>
-        <w:t>ievaddati</w:t>
-      </w:r>
-      <w:proofErr w:type="spellEnd"/>
+        <w:t>Reģistrācijas ievaddati</w:t>
+      </w:r>
     </w:p>
     <w:tbl>
       <w:tblPr>
@@ -2895,23 +2840,7 @@
         </w:numPr>
       </w:pPr>
       <w:r>
-        <w:t xml:space="preserve">Sistēma pārbauda, ka visi ievades lauki ir aizpildīti(gan </w:t>
-      </w:r>
-      <w:proofErr w:type="spellStart"/>
-      <w:r>
-        <w:t>front-end</w:t>
-      </w:r>
-      <w:proofErr w:type="spellEnd"/>
-      <w:r>
-        <w:t xml:space="preserve">, gan </w:t>
-      </w:r>
-      <w:proofErr w:type="spellStart"/>
-      <w:r>
-        <w:t>back-end</w:t>
-      </w:r>
-      <w:proofErr w:type="spellEnd"/>
-      <w:r>
-        <w:t>).</w:t>
+        <w:t>Sistēma pārbauda, ka visi ievades lauki ir aizpildīti(gan front-end, gan back-end).</w:t>
       </w:r>
     </w:p>
     <w:p>
@@ -3007,23 +2936,13 @@
           <w:u w:val="single"/>
         </w:rPr>
       </w:pPr>
-      <w:proofErr w:type="spellStart"/>
       <w:r>
         <w:rPr>
           <w:b/>
           <w:bCs/>
           <w:u w:val="single"/>
         </w:rPr>
-        <w:t>Izvaddati</w:t>
-      </w:r>
-      <w:proofErr w:type="spellEnd"/>
-      <w:r>
-        <w:rPr>
-          <w:b/>
-          <w:bCs/>
-          <w:u w:val="single"/>
-        </w:rPr>
-        <w:t>:</w:t>
+        <w:t>Izvaddati:</w:t>
       </w:r>
     </w:p>
     <w:p>
@@ -3108,7 +3027,6 @@
           <w:u w:val="single"/>
         </w:rPr>
       </w:pPr>
-      <w:proofErr w:type="spellStart"/>
       <w:r>
         <w:rPr>
           <w:b/>
@@ -3116,16 +3034,7 @@
           <w:u w:val="single"/>
         </w:rPr>
         <w:lastRenderedPageBreak/>
-        <w:t>Ievaddati</w:t>
-      </w:r>
-      <w:proofErr w:type="spellEnd"/>
-      <w:r>
-        <w:rPr>
-          <w:b/>
-          <w:bCs/>
-          <w:u w:val="single"/>
-        </w:rPr>
-        <w:t>:</w:t>
+        <w:t>Ievaddati:</w:t>
       </w:r>
     </w:p>
     <w:p>
@@ -3166,17 +3075,8 @@
           <w:b/>
           <w:bCs/>
         </w:rPr>
-        <w:t xml:space="preserve">Autorizācijas </w:t>
-      </w:r>
-      <w:proofErr w:type="spellStart"/>
-      <w:r>
-        <w:rPr>
-          <w:b/>
-          <w:bCs/>
-        </w:rPr>
-        <w:t>ievaddati</w:t>
-      </w:r>
-      <w:proofErr w:type="spellEnd"/>
+        <w:t>Autorizācijas ievaddati</w:t>
+      </w:r>
     </w:p>
     <w:tbl>
       <w:tblPr>
@@ -3428,23 +3328,13 @@
           <w:u w:val="single"/>
         </w:rPr>
       </w:pPr>
-      <w:proofErr w:type="spellStart"/>
       <w:r>
         <w:rPr>
           <w:b/>
           <w:bCs/>
           <w:u w:val="single"/>
         </w:rPr>
-        <w:t>Izvaddati</w:t>
-      </w:r>
-      <w:proofErr w:type="spellEnd"/>
-      <w:r>
-        <w:rPr>
-          <w:b/>
-          <w:bCs/>
-          <w:u w:val="single"/>
-        </w:rPr>
-        <w:t>:</w:t>
+        <w:t>Izvaddati:</w:t>
       </w:r>
     </w:p>
     <w:p>
@@ -3509,23 +3399,13 @@
           <w:u w:val="single"/>
         </w:rPr>
       </w:pPr>
-      <w:proofErr w:type="spellStart"/>
       <w:r>
         <w:rPr>
           <w:b/>
           <w:bCs/>
           <w:u w:val="single"/>
         </w:rPr>
-        <w:t>Ievaddati</w:t>
-      </w:r>
-      <w:proofErr w:type="spellEnd"/>
-      <w:r>
-        <w:rPr>
-          <w:b/>
-          <w:bCs/>
-          <w:u w:val="single"/>
-        </w:rPr>
-        <w:t>:</w:t>
+        <w:t>Ievaddati:</w:t>
       </w:r>
     </w:p>
     <w:p>
@@ -3568,17 +3448,8 @@
           <w:b/>
           <w:bCs/>
         </w:rPr>
-        <w:t xml:space="preserve">Paroles atjaunošanas </w:t>
-      </w:r>
-      <w:proofErr w:type="spellStart"/>
-      <w:r>
-        <w:rPr>
-          <w:b/>
-          <w:bCs/>
-        </w:rPr>
-        <w:t>ievaddati</w:t>
-      </w:r>
-      <w:proofErr w:type="spellEnd"/>
+        <w:t>Paroles atjaunošanas ievaddati</w:t>
+      </w:r>
     </w:p>
     <w:tbl>
       <w:tblPr>
@@ -3676,13 +3547,8 @@
               <w:ind w:firstLine="0"/>
               <w:jc w:val="left"/>
             </w:pPr>
-            <w:proofErr w:type="spellStart"/>
-            <w:r>
-              <w:t>Jabūt</w:t>
-            </w:r>
-            <w:proofErr w:type="spellEnd"/>
-            <w:r>
-              <w:t xml:space="preserve"> reģistrētam sistēmā</w:t>
+            <w:r>
+              <w:t>Jabūt reģistrētam sistēmā</w:t>
             </w:r>
           </w:p>
         </w:tc>
@@ -3719,15 +3585,7 @@
         </w:numPr>
       </w:pPr>
       <w:r>
-        <w:t xml:space="preserve">Sistēma ģenerē paroles atjaunošanas saiti un </w:t>
-      </w:r>
-      <w:proofErr w:type="spellStart"/>
-      <w:r>
-        <w:t>nosūta</w:t>
-      </w:r>
-      <w:proofErr w:type="spellEnd"/>
-      <w:r>
-        <w:t xml:space="preserve"> to uz lietotāja e-pastu.</w:t>
+        <w:t>Sistēma ģenerē paroles atjaunošanas saiti un nosūta to uz lietotāja e-pastu.</w:t>
       </w:r>
     </w:p>
     <w:p>
@@ -3795,7 +3653,6 @@
           <w:u w:val="single"/>
         </w:rPr>
       </w:pPr>
-      <w:proofErr w:type="spellStart"/>
       <w:r>
         <w:rPr>
           <w:b/>
@@ -3803,16 +3660,7 @@
           <w:u w:val="single"/>
         </w:rPr>
         <w:lastRenderedPageBreak/>
-        <w:t>Izvaddati</w:t>
-      </w:r>
-      <w:proofErr w:type="spellEnd"/>
-      <w:r>
-        <w:rPr>
-          <w:b/>
-          <w:bCs/>
-          <w:u w:val="single"/>
-        </w:rPr>
-        <w:t>:</w:t>
+        <w:t>Izvaddati:</w:t>
       </w:r>
     </w:p>
     <w:p>
@@ -3883,23 +3731,13 @@
           <w:u w:val="single"/>
         </w:rPr>
       </w:pPr>
-      <w:proofErr w:type="spellStart"/>
       <w:r>
         <w:rPr>
           <w:b/>
           <w:bCs/>
           <w:u w:val="single"/>
         </w:rPr>
-        <w:t>Ievaddati</w:t>
-      </w:r>
-      <w:proofErr w:type="spellEnd"/>
-      <w:r>
-        <w:rPr>
-          <w:b/>
-          <w:bCs/>
-          <w:u w:val="single"/>
-        </w:rPr>
-        <w:t>:</w:t>
+        <w:t>Ievaddati:</w:t>
       </w:r>
     </w:p>
     <w:p>
@@ -3942,17 +3780,8 @@
           <w:b/>
           <w:bCs/>
         </w:rPr>
-        <w:t xml:space="preserve">Ienākumu pievienošanas </w:t>
-      </w:r>
-      <w:proofErr w:type="spellStart"/>
-      <w:r>
-        <w:rPr>
-          <w:b/>
-          <w:bCs/>
-        </w:rPr>
-        <w:t>ievaddati</w:t>
-      </w:r>
-      <w:proofErr w:type="spellEnd"/>
+        <w:t>Ienākumu pievienošanas ievaddati</w:t>
+      </w:r>
     </w:p>
     <w:tbl>
       <w:tblPr>
@@ -4277,23 +4106,13 @@
           <w:u w:val="single"/>
         </w:rPr>
       </w:pPr>
-      <w:proofErr w:type="spellStart"/>
       <w:r>
         <w:rPr>
           <w:b/>
           <w:bCs/>
           <w:u w:val="single"/>
         </w:rPr>
-        <w:t>Izvaddati</w:t>
-      </w:r>
-      <w:proofErr w:type="spellEnd"/>
-      <w:r>
-        <w:rPr>
-          <w:b/>
-          <w:bCs/>
-          <w:u w:val="single"/>
-        </w:rPr>
-        <w:t>:</w:t>
+        <w:t>Izvaddati:</w:t>
       </w:r>
     </w:p>
     <w:p>
@@ -4380,23 +4199,13 @@
           <w:u w:val="single"/>
         </w:rPr>
       </w:pPr>
-      <w:proofErr w:type="spellStart"/>
       <w:r>
         <w:rPr>
           <w:b/>
           <w:bCs/>
           <w:u w:val="single"/>
         </w:rPr>
-        <w:t>Ievaddati</w:t>
-      </w:r>
-      <w:proofErr w:type="spellEnd"/>
-      <w:r>
-        <w:rPr>
-          <w:b/>
-          <w:bCs/>
-          <w:u w:val="single"/>
-        </w:rPr>
-        <w:t>:</w:t>
+        <w:t>Ievaddati:</w:t>
       </w:r>
     </w:p>
     <w:p>
@@ -4454,17 +4263,8 @@
           <w:b/>
           <w:bCs/>
         </w:rPr>
-        <w:t xml:space="preserve">Izdevumu pievienošanas </w:t>
-      </w:r>
-      <w:proofErr w:type="spellStart"/>
-      <w:r>
-        <w:rPr>
-          <w:b/>
-          <w:bCs/>
-        </w:rPr>
-        <w:t>ievaddati</w:t>
-      </w:r>
-      <w:proofErr w:type="spellEnd"/>
+        <w:t>Izdevumu pievienošanas ievaddati</w:t>
+      </w:r>
     </w:p>
     <w:tbl>
       <w:tblPr>
@@ -4777,23 +4577,13 @@
           <w:u w:val="single"/>
         </w:rPr>
       </w:pPr>
-      <w:proofErr w:type="spellStart"/>
       <w:r>
         <w:rPr>
           <w:b/>
           <w:bCs/>
           <w:u w:val="single"/>
         </w:rPr>
-        <w:t>Izvaddati</w:t>
-      </w:r>
-      <w:proofErr w:type="spellEnd"/>
-      <w:r>
-        <w:rPr>
-          <w:b/>
-          <w:bCs/>
-          <w:u w:val="single"/>
-        </w:rPr>
-        <w:t>:</w:t>
+        <w:t>Izvaddati:</w:t>
       </w:r>
     </w:p>
     <w:p>
@@ -4830,17 +4620,8 @@
           <w:b/>
           <w:bCs/>
         </w:rPr>
-        <w:t xml:space="preserve">6. Ierakstu </w:t>
-      </w:r>
-      <w:proofErr w:type="spellStart"/>
-      <w:r>
-        <w:rPr>
-          <w:b/>
-          <w:bCs/>
-        </w:rPr>
-        <w:t>rediģēsana</w:t>
-      </w:r>
-      <w:proofErr w:type="spellEnd"/>
+        <w:t>6. Ierakstu rediģēsana</w:t>
+      </w:r>
     </w:p>
     <w:p>
       <w:pPr>
@@ -4878,23 +4659,13 @@
           <w:u w:val="single"/>
         </w:rPr>
       </w:pPr>
-      <w:proofErr w:type="spellStart"/>
       <w:r>
         <w:rPr>
           <w:b/>
           <w:bCs/>
           <w:u w:val="single"/>
         </w:rPr>
-        <w:t>Ievaddati</w:t>
-      </w:r>
-      <w:proofErr w:type="spellEnd"/>
-      <w:r>
-        <w:rPr>
-          <w:b/>
-          <w:bCs/>
-          <w:u w:val="single"/>
-        </w:rPr>
-        <w:t>:</w:t>
+        <w:t>Ievaddati:</w:t>
       </w:r>
     </w:p>
     <w:p>
@@ -4937,17 +4708,8 @@
           <w:b/>
           <w:bCs/>
         </w:rPr>
-        <w:t xml:space="preserve">Rediģēšanas </w:t>
-      </w:r>
-      <w:proofErr w:type="spellStart"/>
-      <w:r>
-        <w:rPr>
-          <w:b/>
-          <w:bCs/>
-        </w:rPr>
-        <w:t>ievaddati</w:t>
-      </w:r>
-      <w:proofErr w:type="spellEnd"/>
+        <w:t>Rediģēšanas ievaddati</w:t>
+      </w:r>
     </w:p>
     <w:tbl>
       <w:tblPr>
@@ -5294,47 +5056,37 @@
           <w:u w:val="single"/>
         </w:rPr>
       </w:pPr>
-      <w:proofErr w:type="spellStart"/>
       <w:r>
         <w:rPr>
           <w:b/>
           <w:bCs/>
           <w:u w:val="single"/>
         </w:rPr>
-        <w:t>Izvaddati</w:t>
-      </w:r>
-      <w:proofErr w:type="spellEnd"/>
+        <w:t>Izvaddati:</w:t>
+      </w:r>
       <w:r>
         <w:rPr>
           <w:b/>
           <w:bCs/>
           <w:u w:val="single"/>
         </w:rPr>
-        <w:t>:</w:t>
-      </w:r>
-      <w:r>
+        <w:t xml:space="preserve"> </w:t>
+      </w:r>
+    </w:p>
+    <w:p>
+      <w:r>
+        <w:t>Ieraksts veiksmīgi atjaunots.</w:t>
+      </w:r>
+    </w:p>
+    <w:p/>
+    <w:p>
+      <w:pPr>
+        <w:ind w:firstLine="0"/>
         <w:rPr>
           <w:b/>
           <w:bCs/>
           <w:u w:val="single"/>
         </w:rPr>
-        <w:t xml:space="preserve"> </w:t>
-      </w:r>
-    </w:p>
-    <w:p>
-      <w:r>
-        <w:t>Ieraksts veiksmīgi atjaunots.</w:t>
-      </w:r>
-    </w:p>
-    <w:p/>
-    <w:p>
-      <w:pPr>
-        <w:ind w:firstLine="0"/>
-        <w:rPr>
-          <w:b/>
-          <w:bCs/>
-          <w:u w:val="single"/>
-        </w:rPr>
       </w:pPr>
       <w:r>
         <w:rPr>
@@ -5383,21 +5135,12 @@
           <w:bCs/>
         </w:rPr>
       </w:pPr>
-      <w:proofErr w:type="spellStart"/>
-      <w:r>
-        <w:rPr>
-          <w:b/>
-          <w:bCs/>
-        </w:rPr>
-        <w:t>Ievaddati</w:t>
-      </w:r>
-      <w:proofErr w:type="spellEnd"/>
-      <w:r>
-        <w:rPr>
-          <w:b/>
-          <w:bCs/>
-        </w:rPr>
-        <w:t>:</w:t>
+      <w:r>
+        <w:rPr>
+          <w:b/>
+          <w:bCs/>
+        </w:rPr>
+        <w:t>Ievaddati:</w:t>
       </w:r>
     </w:p>
     <w:p>
@@ -5436,17 +5179,8 @@
           <w:b/>
           <w:bCs/>
         </w:rPr>
-        <w:t xml:space="preserve">Dzēst </w:t>
-      </w:r>
-      <w:proofErr w:type="spellStart"/>
-      <w:r>
-        <w:rPr>
-          <w:b/>
-          <w:bCs/>
-        </w:rPr>
-        <w:t>iearkastu</w:t>
-      </w:r>
-      <w:proofErr w:type="spellEnd"/>
+        <w:t>Dzēst iearkastu</w:t>
+      </w:r>
     </w:p>
     <w:tbl>
       <w:tblPr>
@@ -5654,21 +5388,12 @@
           <w:bCs/>
         </w:rPr>
       </w:pPr>
-      <w:proofErr w:type="spellStart"/>
-      <w:r>
-        <w:rPr>
-          <w:b/>
-          <w:bCs/>
-        </w:rPr>
-        <w:t>Izvaddati</w:t>
-      </w:r>
-      <w:proofErr w:type="spellEnd"/>
-      <w:r>
-        <w:rPr>
-          <w:b/>
-          <w:bCs/>
-        </w:rPr>
-        <w:t>:</w:t>
+      <w:r>
+        <w:rPr>
+          <w:b/>
+          <w:bCs/>
+        </w:rPr>
+        <w:t>Izvaddati:</w:t>
       </w:r>
     </w:p>
     <w:p>
@@ -5740,21 +5465,12 @@
           <w:bCs/>
         </w:rPr>
       </w:pPr>
-      <w:proofErr w:type="spellStart"/>
-      <w:r>
-        <w:rPr>
-          <w:b/>
-          <w:bCs/>
-        </w:rPr>
-        <w:t>Ievaddati</w:t>
-      </w:r>
-      <w:proofErr w:type="spellEnd"/>
-      <w:r>
-        <w:rPr>
-          <w:b/>
-          <w:bCs/>
-        </w:rPr>
-        <w:t>:</w:t>
+      <w:r>
+        <w:rPr>
+          <w:b/>
+          <w:bCs/>
+        </w:rPr>
+        <w:t>Ievaddati:</w:t>
       </w:r>
     </w:p>
     <w:p>
@@ -6090,21 +5806,12 @@
           <w:bCs/>
         </w:rPr>
       </w:pPr>
-      <w:proofErr w:type="spellStart"/>
-      <w:r>
-        <w:rPr>
-          <w:b/>
-          <w:bCs/>
-        </w:rPr>
-        <w:t>Izvaddati</w:t>
-      </w:r>
-      <w:proofErr w:type="spellEnd"/>
-      <w:r>
-        <w:rPr>
-          <w:b/>
-          <w:bCs/>
-        </w:rPr>
-        <w:t>:</w:t>
+      <w:r>
+        <w:rPr>
+          <w:b/>
+          <w:bCs/>
+        </w:rPr>
+        <w:t>Izvaddati:</w:t>
       </w:r>
     </w:p>
     <w:p>
@@ -6210,21 +5917,12 @@
           <w:bCs/>
         </w:rPr>
       </w:pPr>
-      <w:proofErr w:type="spellStart"/>
-      <w:r>
-        <w:rPr>
-          <w:b/>
-          <w:bCs/>
-        </w:rPr>
-        <w:t>Ievaddati</w:t>
-      </w:r>
-      <w:proofErr w:type="spellEnd"/>
-      <w:r>
-        <w:rPr>
-          <w:b/>
-          <w:bCs/>
-        </w:rPr>
-        <w:t>:</w:t>
+      <w:r>
+        <w:rPr>
+          <w:b/>
+          <w:bCs/>
+        </w:rPr>
+        <w:t>Ievaddati:</w:t>
       </w:r>
     </w:p>
     <w:p>
@@ -6593,19 +6291,68 @@
       <w:pPr>
         <w:ind w:firstLine="0"/>
       </w:pPr>
-      <w:proofErr w:type="spellStart"/>
       <w:r>
         <w:rPr>
           <w:rStyle w:val="Strong"/>
         </w:rPr>
-        <w:t>Izvaddati</w:t>
-      </w:r>
-      <w:proofErr w:type="spellEnd"/>
+        <w:t>Izvaddati:</w:t>
+      </w:r>
+      <w:r>
+        <w:t xml:space="preserve"> </w:t>
+      </w:r>
+    </w:p>
+    <w:p>
+      <w:r>
+        <w:t>Ierakstu saraksts, kas atbilst lietotāja meklēšanas nosacījumiem.</w:t>
+      </w:r>
+    </w:p>
+    <w:p/>
+    <w:p>
+      <w:pPr>
+        <w:ind w:firstLine="0"/>
+        <w:rPr>
+          <w:b/>
+          <w:bCs/>
+        </w:rPr>
+      </w:pPr>
+      <w:r>
+        <w:rPr>
+          <w:b/>
+          <w:bCs/>
+        </w:rPr>
+        <w:t>P.1</w:t>
+      </w:r>
+      <w:r>
+        <w:rPr>
+          <w:b/>
+          <w:bCs/>
+        </w:rPr>
+        <w:t>0</w:t>
+      </w:r>
+      <w:r>
+        <w:rPr>
+          <w:b/>
+          <w:bCs/>
+        </w:rPr>
+        <w:t>.</w:t>
+      </w:r>
+      <w:r>
+        <w:rPr>
+          <w:b/>
+          <w:bCs/>
+        </w:rPr>
+        <w:t xml:space="preserve"> Bilances aprēķināšana</w:t>
+      </w:r>
+    </w:p>
+    <w:p>
+      <w:pPr>
+        <w:ind w:firstLine="0"/>
+      </w:pPr>
       <w:r>
         <w:rPr>
           <w:rStyle w:val="Strong"/>
         </w:rPr>
-        <w:t>:</w:t>
+        <w:t>Mērķis:</w:t>
       </w:r>
       <w:r>
         <w:t xml:space="preserve"> </w:t>
@@ -6613,63 +6360,6 @@
     </w:p>
     <w:p>
       <w:r>
-        <w:t>Ierakstu saraksts, kas atbilst lietotāja meklēšanas nosacījumiem.</w:t>
-      </w:r>
-    </w:p>
-    <w:p/>
-    <w:p>
-      <w:pPr>
-        <w:ind w:firstLine="0"/>
-        <w:rPr>
-          <w:b/>
-          <w:bCs/>
-        </w:rPr>
-      </w:pPr>
-      <w:r>
-        <w:rPr>
-          <w:b/>
-          <w:bCs/>
-        </w:rPr>
-        <w:t>P.1</w:t>
-      </w:r>
-      <w:r>
-        <w:rPr>
-          <w:b/>
-          <w:bCs/>
-        </w:rPr>
-        <w:t>0</w:t>
-      </w:r>
-      <w:r>
-        <w:rPr>
-          <w:b/>
-          <w:bCs/>
-        </w:rPr>
-        <w:t>.</w:t>
-      </w:r>
-      <w:r>
-        <w:rPr>
-          <w:b/>
-          <w:bCs/>
-        </w:rPr>
-        <w:t xml:space="preserve"> Bilances aprēķināšana</w:t>
-      </w:r>
-    </w:p>
-    <w:p>
-      <w:pPr>
-        <w:ind w:firstLine="0"/>
-      </w:pPr>
-      <w:r>
-        <w:rPr>
-          <w:rStyle w:val="Strong"/>
-        </w:rPr>
-        <w:t>Mērķis:</w:t>
-      </w:r>
-      <w:r>
-        <w:t xml:space="preserve"> </w:t>
-      </w:r>
-    </w:p>
-    <w:p>
-      <w:r>
         <w:t>Nodrošināt lietotājam aktuālu informāciju par ienākumu un izdevumu bilanci.</w:t>
       </w:r>
     </w:p>
@@ -6681,21 +6371,12 @@
           <w:bCs/>
         </w:rPr>
       </w:pPr>
-      <w:proofErr w:type="spellStart"/>
-      <w:r>
-        <w:rPr>
-          <w:b/>
-          <w:bCs/>
-        </w:rPr>
-        <w:t>Apstrade</w:t>
-      </w:r>
-      <w:proofErr w:type="spellEnd"/>
-      <w:r>
-        <w:rPr>
-          <w:b/>
-          <w:bCs/>
-        </w:rPr>
-        <w:t>:</w:t>
+      <w:r>
+        <w:rPr>
+          <w:b/>
+          <w:bCs/>
+        </w:rPr>
+        <w:t>Apstrade:</w:t>
       </w:r>
     </w:p>
     <w:p>
@@ -6707,15 +6388,7 @@
         </w:numPr>
       </w:pPr>
       <w:r>
-        <w:t xml:space="preserve">Sistēma apkopo visus ienākumu un izdevumu ierakstus </w:t>
-      </w:r>
-      <w:proofErr w:type="spellStart"/>
-      <w:r>
-        <w:t>automatiski</w:t>
-      </w:r>
-      <w:proofErr w:type="spellEnd"/>
-      <w:r>
-        <w:t>.</w:t>
+        <w:t>Sistēma apkopo visus ienākumu un izdevumu ierakstus automatiski.</w:t>
       </w:r>
     </w:p>
     <w:p>
@@ -6793,7 +6466,6 @@
           <w:bCs/>
         </w:rPr>
       </w:pPr>
-      <w:proofErr w:type="spellStart"/>
       <w:r>
         <w:rPr>
           <w:b/>
@@ -6802,7 +6474,6 @@
         <w:lastRenderedPageBreak/>
         <w:t>Izvaddati</w:t>
       </w:r>
-      <w:proofErr w:type="spellEnd"/>
       <w:r>
         <w:rPr>
           <w:b/>
@@ -6885,21 +6556,12 @@
           <w:bCs/>
         </w:rPr>
       </w:pPr>
-      <w:proofErr w:type="spellStart"/>
-      <w:r>
-        <w:rPr>
-          <w:b/>
-          <w:bCs/>
-        </w:rPr>
-        <w:t>Ievaddati</w:t>
-      </w:r>
-      <w:proofErr w:type="spellEnd"/>
-      <w:r>
-        <w:rPr>
-          <w:b/>
-          <w:bCs/>
-        </w:rPr>
-        <w:t>:</w:t>
+      <w:r>
+        <w:rPr>
+          <w:b/>
+          <w:bCs/>
+        </w:rPr>
+        <w:t>Ievaddati:</w:t>
       </w:r>
     </w:p>
     <w:p>
@@ -7220,19 +6882,11 @@
       <w:pPr>
         <w:ind w:firstLine="0"/>
       </w:pPr>
-      <w:proofErr w:type="spellStart"/>
       <w:r>
         <w:rPr>
           <w:rStyle w:val="Strong"/>
         </w:rPr>
-        <w:t>Izvaddati</w:t>
-      </w:r>
-      <w:proofErr w:type="spellEnd"/>
-      <w:r>
-        <w:rPr>
-          <w:rStyle w:val="Strong"/>
-        </w:rPr>
-        <w:t>:</w:t>
+        <w:t>Izvaddati:</w:t>
       </w:r>
     </w:p>
     <w:p>
@@ -7341,19 +6995,11 @@
       <w:pPr>
         <w:ind w:firstLine="0"/>
       </w:pPr>
-      <w:proofErr w:type="spellStart"/>
       <w:r>
         <w:rPr>
           <w:rStyle w:val="Strong"/>
         </w:rPr>
-        <w:t>Izvaddati</w:t>
-      </w:r>
-      <w:proofErr w:type="spellEnd"/>
-      <w:r>
-        <w:rPr>
-          <w:rStyle w:val="Strong"/>
-        </w:rPr>
-        <w:t>:</w:t>
+        <w:t>Izvaddati:</w:t>
       </w:r>
       <w:r>
         <w:t xml:space="preserve"> </w:t>
@@ -7449,15 +7095,7 @@
         </w:numPr>
       </w:pPr>
       <w:r>
-        <w:t xml:space="preserve">Sistēma šifrē paroles un </w:t>
-      </w:r>
-      <w:proofErr w:type="spellStart"/>
-      <w:r>
-        <w:t>sensitīvus</w:t>
-      </w:r>
-      <w:proofErr w:type="spellEnd"/>
-      <w:r>
-        <w:t xml:space="preserve"> datus pirms saglabāšanas.</w:t>
+        <w:t>Sistēma šifrē paroles un sensitīvus datus pirms saglabāšanas.</w:t>
       </w:r>
     </w:p>
     <w:p>
@@ -7494,19 +7132,6 @@
     </w:p>
     <w:p>
       <w:pPr>
-        <w:pStyle w:val="ListParagraph"/>
-        <w:numPr>
-          <w:ilvl w:val="0"/>
-          <w:numId w:val="14"/>
-        </w:numPr>
-        <w:rPr>
-          <w:b/>
-          <w:bCs/>
-        </w:rPr>
-      </w:pPr>
-    </w:p>
-    <w:p>
-      <w:pPr>
         <w:ind w:firstLine="0"/>
         <w:rPr>
           <w:b/>
@@ -7548,21 +7173,12 @@
           <w:bCs/>
         </w:rPr>
       </w:pPr>
-      <w:proofErr w:type="spellStart"/>
-      <w:r>
-        <w:rPr>
-          <w:b/>
-          <w:bCs/>
-        </w:rPr>
-        <w:t>Ievaddati</w:t>
-      </w:r>
-      <w:proofErr w:type="spellEnd"/>
-      <w:r>
-        <w:rPr>
-          <w:b/>
-          <w:bCs/>
-        </w:rPr>
-        <w:t>:</w:t>
+      <w:r>
+        <w:rPr>
+          <w:b/>
+          <w:bCs/>
+        </w:rPr>
+        <w:t>Ievaddati:</w:t>
       </w:r>
     </w:p>
     <w:p>
@@ -7917,44 +7533,52 @@
       <w:pPr>
         <w:ind w:firstLine="0"/>
       </w:pPr>
-      <w:proofErr w:type="spellStart"/>
       <w:r>
         <w:rPr>
           <w:rStyle w:val="Strong"/>
         </w:rPr>
-        <w:t>Izvaddati</w:t>
-      </w:r>
-      <w:proofErr w:type="spellEnd"/>
+        <w:t>Izvaddati:</w:t>
+      </w:r>
+      <w:r>
+        <w:t xml:space="preserve"> </w:t>
+      </w:r>
+    </w:p>
+    <w:p>
+      <w:r>
+        <w:t>Atjaunots lietotāja profils.</w:t>
+      </w:r>
+    </w:p>
+    <w:p/>
+    <w:p>
+      <w:pPr>
+        <w:ind w:firstLine="0"/>
+        <w:rPr>
+          <w:b/>
+          <w:bCs/>
+        </w:rPr>
+      </w:pPr>
+      <w:r>
+        <w:rPr>
+          <w:b/>
+          <w:bCs/>
+        </w:rPr>
+        <w:t>P.17. Izrakstīšanās</w:t>
+      </w:r>
+    </w:p>
+    <w:p>
+      <w:pPr>
+        <w:ind w:firstLine="0"/>
+      </w:pPr>
       <w:r>
         <w:rPr>
           <w:rStyle w:val="Strong"/>
         </w:rPr>
-        <w:t>:</w:t>
-      </w:r>
-      <w:r>
-        <w:t xml:space="preserve"> </w:t>
-      </w:r>
-    </w:p>
-    <w:p>
-      <w:r>
-        <w:t>Atjaunots lietotāja profils.</w:t>
-      </w:r>
-    </w:p>
-    <w:p/>
-    <w:p>
-      <w:pPr>
-        <w:ind w:firstLine="0"/>
-        <w:rPr>
-          <w:b/>
-          <w:bCs/>
-        </w:rPr>
-      </w:pPr>
-      <w:r>
-        <w:rPr>
-          <w:b/>
-          <w:bCs/>
-        </w:rPr>
-        <w:t>P.17. Izrakstīšanās</w:t>
+        <w:t>Mērķis:</w:t>
+      </w:r>
+    </w:p>
+    <w:p>
+      <w:r>
+        <w:t>Nodrošināt lietotājam iespēju droši iziet no sistēmas.</w:t>
       </w:r>
     </w:p>
     <w:p>
@@ -7965,42 +7589,10 @@
         <w:rPr>
           <w:rStyle w:val="Strong"/>
         </w:rPr>
-        <w:t>Mērķis:</w:t>
-      </w:r>
-    </w:p>
-    <w:p>
-      <w:r>
-        <w:t>Nodrošināt lietotājam iespēju droši iziet no sistēmas.</w:t>
-      </w:r>
-    </w:p>
-    <w:p>
-      <w:pPr>
-        <w:ind w:firstLine="0"/>
-      </w:pPr>
-      <w:proofErr w:type="spellStart"/>
-      <w:r>
-        <w:rPr>
-          <w:rStyle w:val="Strong"/>
-        </w:rPr>
-        <w:t>Ievaddati</w:t>
-      </w:r>
-      <w:proofErr w:type="spellEnd"/>
-      <w:r>
-        <w:rPr>
-          <w:rStyle w:val="Strong"/>
-        </w:rPr>
-        <w:t>:</w:t>
-      </w:r>
-      <w:r>
-        <w:t xml:space="preserve"> Iziet pogas </w:t>
-      </w:r>
-      <w:proofErr w:type="spellStart"/>
-      <w:r>
-        <w:t>uzpiešana</w:t>
-      </w:r>
-      <w:proofErr w:type="spellEnd"/>
-      <w:r>
-        <w:t>.</w:t>
+        <w:t>Ievaddati:</w:t>
+      </w:r>
+      <w:r>
+        <w:t xml:space="preserve"> Iziet pogas uzpiešana.</w:t>
       </w:r>
     </w:p>
     <w:p>
@@ -8066,65 +7658,57 @@
       <w:pPr>
         <w:ind w:firstLine="0"/>
       </w:pPr>
-      <w:proofErr w:type="spellStart"/>
       <w:r>
         <w:rPr>
           <w:rStyle w:val="Strong"/>
         </w:rPr>
-        <w:t>Izvaddati</w:t>
-      </w:r>
-      <w:proofErr w:type="spellEnd"/>
+        <w:t>Izvaddati:</w:t>
+      </w:r>
+    </w:p>
+    <w:p>
+      <w:r>
+        <w:t>Lietotājs ir izrakstījies no konta.</w:t>
+      </w:r>
+    </w:p>
+    <w:p/>
+    <w:p>
+      <w:pPr>
+        <w:ind w:firstLine="0"/>
+        <w:rPr>
+          <w:b/>
+          <w:bCs/>
+        </w:rPr>
+      </w:pPr>
+      <w:r>
+        <w:rPr>
+          <w:b/>
+          <w:bCs/>
+        </w:rPr>
+        <w:t>P.</w:t>
+      </w:r>
+      <w:r>
+        <w:rPr>
+          <w:b/>
+          <w:bCs/>
+        </w:rPr>
+        <w:t>18</w:t>
+      </w:r>
+      <w:r>
+        <w:rPr>
+          <w:b/>
+          <w:bCs/>
+        </w:rPr>
+        <w:t>. Valūtas izvēle</w:t>
+      </w:r>
+    </w:p>
+    <w:p>
+      <w:pPr>
+        <w:ind w:firstLine="0"/>
+      </w:pPr>
       <w:r>
         <w:rPr>
           <w:rStyle w:val="Strong"/>
         </w:rPr>
-        <w:t>:</w:t>
-      </w:r>
-    </w:p>
-    <w:p>
-      <w:r>
-        <w:t>Lietotājs ir izrakstījies no konta.</w:t>
-      </w:r>
-    </w:p>
-    <w:p/>
-    <w:p>
-      <w:pPr>
-        <w:ind w:firstLine="0"/>
-        <w:rPr>
-          <w:b/>
-          <w:bCs/>
-        </w:rPr>
-      </w:pPr>
-      <w:r>
-        <w:rPr>
-          <w:b/>
-          <w:bCs/>
-        </w:rPr>
-        <w:t>P.</w:t>
-      </w:r>
-      <w:r>
-        <w:rPr>
-          <w:b/>
-          <w:bCs/>
-        </w:rPr>
-        <w:t>18</w:t>
-      </w:r>
-      <w:r>
-        <w:rPr>
-          <w:b/>
-          <w:bCs/>
-        </w:rPr>
-        <w:t>. Valūtas izvēle</w:t>
-      </w:r>
-    </w:p>
-    <w:p>
-      <w:pPr>
-        <w:ind w:firstLine="0"/>
-      </w:pPr>
-      <w:r>
-        <w:rPr>
-          <w:rStyle w:val="Strong"/>
-        </w:rPr>
         <w:t>Mērķis:</w:t>
       </w:r>
       <w:r>
@@ -8144,21 +7728,12 @@
           <w:bCs/>
         </w:rPr>
       </w:pPr>
-      <w:proofErr w:type="spellStart"/>
-      <w:r>
-        <w:rPr>
-          <w:b/>
-          <w:bCs/>
-        </w:rPr>
-        <w:t>Ievaddati</w:t>
-      </w:r>
-      <w:proofErr w:type="spellEnd"/>
-      <w:r>
-        <w:rPr>
-          <w:b/>
-          <w:bCs/>
-        </w:rPr>
-        <w:t>:</w:t>
+      <w:r>
+        <w:rPr>
+          <w:b/>
+          <w:bCs/>
+        </w:rPr>
+        <w:t>Ievaddati:</w:t>
       </w:r>
     </w:p>
     <w:p>
@@ -8372,98 +7947,90 @@
       <w:pPr>
         <w:ind w:firstLine="0"/>
       </w:pPr>
-      <w:proofErr w:type="spellStart"/>
       <w:r>
         <w:rPr>
           <w:rStyle w:val="Strong"/>
         </w:rPr>
-        <w:t>Izvaddati</w:t>
-      </w:r>
-      <w:proofErr w:type="spellEnd"/>
+        <w:t>Izvaddati:</w:t>
+      </w:r>
+    </w:p>
+    <w:p>
+      <w:r>
+        <w:t>Finanšu dati attēloti izvēlētajā valūtā.</w:t>
+      </w:r>
+    </w:p>
+    <w:p/>
+    <w:p>
+      <w:pPr>
+        <w:ind w:firstLine="0"/>
+        <w:rPr>
+          <w:b/>
+          <w:bCs/>
+        </w:rPr>
+      </w:pPr>
+      <w:r>
+        <w:rPr>
+          <w:b/>
+          <w:bCs/>
+        </w:rPr>
+        <w:t>P.</w:t>
+      </w:r>
+      <w:r>
+        <w:rPr>
+          <w:b/>
+          <w:bCs/>
+        </w:rPr>
+        <w:t>1</w:t>
+      </w:r>
+      <w:r>
+        <w:rPr>
+          <w:b/>
+          <w:bCs/>
+        </w:rPr>
+        <w:t>9</w:t>
+      </w:r>
+      <w:r>
+        <w:rPr>
+          <w:b/>
+          <w:bCs/>
+        </w:rPr>
+        <w:t>. Va</w:t>
+      </w:r>
+      <w:r>
+        <w:rPr>
+          <w:b/>
+          <w:bCs/>
+        </w:rPr>
+        <w:t>lodas</w:t>
+      </w:r>
+      <w:r>
+        <w:rPr>
+          <w:b/>
+          <w:bCs/>
+        </w:rPr>
+        <w:t xml:space="preserve"> </w:t>
+      </w:r>
+      <w:r>
+        <w:rPr>
+          <w:b/>
+          <w:bCs/>
+        </w:rPr>
+        <w:t>maiņa</w:t>
+      </w:r>
+    </w:p>
+    <w:p>
+      <w:pPr>
+        <w:ind w:firstLine="0"/>
+      </w:pPr>
       <w:r>
         <w:rPr>
           <w:rStyle w:val="Strong"/>
         </w:rPr>
-        <w:t>:</w:t>
-      </w:r>
-    </w:p>
-    <w:p>
-      <w:r>
-        <w:t>Finanšu dati attēloti izvēlētajā valūtā.</w:t>
-      </w:r>
-    </w:p>
-    <w:p/>
-    <w:p>
-      <w:pPr>
-        <w:ind w:firstLine="0"/>
-        <w:rPr>
-          <w:b/>
-          <w:bCs/>
-        </w:rPr>
-      </w:pPr>
-      <w:r>
-        <w:rPr>
-          <w:b/>
-          <w:bCs/>
-        </w:rPr>
-        <w:t>P.</w:t>
-      </w:r>
-      <w:r>
-        <w:rPr>
-          <w:b/>
-          <w:bCs/>
-        </w:rPr>
-        <w:t>1</w:t>
-      </w:r>
-      <w:r>
-        <w:rPr>
-          <w:b/>
-          <w:bCs/>
-        </w:rPr>
-        <w:t>9</w:t>
-      </w:r>
-      <w:r>
-        <w:rPr>
-          <w:b/>
-          <w:bCs/>
-        </w:rPr>
-        <w:t>. Va</w:t>
-      </w:r>
-      <w:r>
-        <w:rPr>
-          <w:b/>
-          <w:bCs/>
-        </w:rPr>
-        <w:t>lodas</w:t>
-      </w:r>
-      <w:r>
-        <w:rPr>
-          <w:b/>
-          <w:bCs/>
-        </w:rPr>
+        <w:t>Mērķis:</w:t>
+      </w:r>
+      <w:r>
         <w:t xml:space="preserve"> </w:t>
       </w:r>
-      <w:r>
-        <w:rPr>
-          <w:b/>
-          <w:bCs/>
-        </w:rPr>
-        <w:t>maiņa</w:t>
-      </w:r>
-    </w:p>
-    <w:p>
-      <w:pPr>
-        <w:ind w:firstLine="0"/>
-      </w:pPr>
-      <w:r>
-        <w:rPr>
-          <w:rStyle w:val="Strong"/>
-        </w:rPr>
-        <w:t>Mērķis:</w:t>
-      </w:r>
-      <w:r>
-        <w:t xml:space="preserve"> </w:t>
-      </w:r>
     </w:p>
     <w:p>
       <w:r>
@@ -8478,21 +8045,12 @@
           <w:bCs/>
         </w:rPr>
       </w:pPr>
-      <w:proofErr w:type="spellStart"/>
-      <w:r>
-        <w:rPr>
-          <w:b/>
-          <w:bCs/>
-        </w:rPr>
-        <w:t>Ievaddati</w:t>
-      </w:r>
-      <w:proofErr w:type="spellEnd"/>
-      <w:r>
-        <w:rPr>
-          <w:b/>
-          <w:bCs/>
-        </w:rPr>
-        <w:t>:</w:t>
+      <w:r>
+        <w:rPr>
+          <w:b/>
+          <w:bCs/>
+        </w:rPr>
+        <w:t>Ievaddati:</w:t>
       </w:r>
     </w:p>
     <w:p>
@@ -8738,19 +8296,11 @@
           <w:bCs/>
         </w:rPr>
       </w:pPr>
-      <w:proofErr w:type="spellStart"/>
       <w:r>
         <w:rPr>
           <w:rStyle w:val="Strong"/>
         </w:rPr>
-        <w:t>Izvaddati</w:t>
-      </w:r>
-      <w:proofErr w:type="spellEnd"/>
-      <w:r>
-        <w:rPr>
-          <w:rStyle w:val="Strong"/>
-        </w:rPr>
-        <w:t>:</w:t>
+        <w:t>Izvaddati:</w:t>
       </w:r>
       <w:r>
         <w:t xml:space="preserve"> </w:t>
@@ -8831,21 +8381,12 @@
           <w:bCs/>
         </w:rPr>
       </w:pPr>
-      <w:proofErr w:type="spellStart"/>
-      <w:r>
-        <w:rPr>
-          <w:b/>
-          <w:bCs/>
-        </w:rPr>
-        <w:t>Ievaddati</w:t>
-      </w:r>
-      <w:proofErr w:type="spellEnd"/>
-      <w:r>
-        <w:rPr>
-          <w:b/>
-          <w:bCs/>
-        </w:rPr>
-        <w:t>:</w:t>
+      <w:r>
+        <w:rPr>
+          <w:b/>
+          <w:bCs/>
+        </w:rPr>
+        <w:t>Ievaddati:</w:t>
       </w:r>
     </w:p>
     <w:p>
@@ -9175,21 +8716,12 @@
           <w:bCs/>
         </w:rPr>
       </w:pPr>
-      <w:proofErr w:type="spellStart"/>
-      <w:r>
-        <w:rPr>
-          <w:b/>
-          <w:bCs/>
-        </w:rPr>
-        <w:t>Izvaddati</w:t>
-      </w:r>
-      <w:proofErr w:type="spellEnd"/>
-      <w:r>
-        <w:rPr>
-          <w:b/>
-          <w:bCs/>
-        </w:rPr>
-        <w:t>:</w:t>
+      <w:r>
+        <w:rPr>
+          <w:b/>
+          <w:bCs/>
+        </w:rPr>
+        <w:t>Izvaddati:</w:t>
       </w:r>
     </w:p>
     <w:p>
@@ -9262,15 +8794,7 @@
     </w:p>
     <w:p>
       <w:r>
-        <w:t xml:space="preserve">Nodrošināt lietotājam iespēju pielāgot sistēmas izskatu, mainot lietotāja </w:t>
-      </w:r>
-      <w:proofErr w:type="spellStart"/>
-      <w:r>
-        <w:t>saskarnes</w:t>
-      </w:r>
-      <w:proofErr w:type="spellEnd"/>
-      <w:r>
-        <w:t xml:space="preserve"> fona krāsu atbilstoši personīgajām vēlmēm.</w:t>
+        <w:t>Nodrošināt lietotājam iespēju pielāgot sistēmas izskatu, mainot lietotāja saskarnes fona krāsu atbilstoši personīgajām vēlmēm.</w:t>
       </w:r>
     </w:p>
     <w:p>
@@ -9324,15 +8848,7 @@
         </w:numPr>
       </w:pPr>
       <w:r>
-        <w:t xml:space="preserve">Sistēma nekavējoties piemēro izvēlēto krāsu </w:t>
-      </w:r>
-      <w:proofErr w:type="spellStart"/>
-      <w:r>
-        <w:t>saskarnes</w:t>
-      </w:r>
-      <w:proofErr w:type="spellEnd"/>
-      <w:r>
-        <w:t xml:space="preserve"> fonam.</w:t>
+        <w:t>Sistēma nekavējoties piemēro izvēlēto krāsu saskarnes fonam.</w:t>
       </w:r>
     </w:p>
     <w:p>
@@ -9367,40 +8883,23 @@
           <w:bCs/>
         </w:rPr>
       </w:pPr>
-      <w:proofErr w:type="spellStart"/>
-      <w:r>
-        <w:rPr>
-          <w:b/>
-          <w:bCs/>
-        </w:rPr>
-        <w:t>Izvaddati</w:t>
-      </w:r>
-      <w:proofErr w:type="spellEnd"/>
-      <w:r>
-        <w:rPr>
-          <w:b/>
-          <w:bCs/>
-        </w:rPr>
-        <w:t>:</w:t>
-      </w:r>
-    </w:p>
-    <w:p>
-      <w:pPr>
-        <w:rPr>
-          <w:b/>
-          <w:bCs/>
-        </w:rPr>
-      </w:pPr>
-      <w:r>
-        <w:t xml:space="preserve">Lietotāja </w:t>
-      </w:r>
-      <w:proofErr w:type="spellStart"/>
-      <w:r>
-        <w:t>saskarnē</w:t>
-      </w:r>
-      <w:proofErr w:type="spellEnd"/>
-      <w:r>
-        <w:t xml:space="preserve"> tiek piemērota izvēlētā fona krāsa</w:t>
+      <w:r>
+        <w:rPr>
+          <w:b/>
+          <w:bCs/>
+        </w:rPr>
+        <w:t>Izvaddati:</w:t>
+      </w:r>
+    </w:p>
+    <w:p>
+      <w:pPr>
+        <w:rPr>
+          <w:b/>
+          <w:bCs/>
+        </w:rPr>
+      </w:pPr>
+      <w:r>
+        <w:t>Lietotāja saskarnē tiek piemērota izvēlētā fona krāsa</w:t>
       </w:r>
       <w:r>
         <w:t>.</w:t>
@@ -9442,15 +8941,7 @@
     </w:p>
     <w:p>
       <w:r>
-        <w:t xml:space="preserve">Sistēmai jānodrošina ātra reakcija uz lietotāja darbībām, lapu </w:t>
-      </w:r>
-      <w:proofErr w:type="spellStart"/>
-      <w:r>
-        <w:t>ielādes</w:t>
-      </w:r>
-      <w:proofErr w:type="spellEnd"/>
-      <w:r>
-        <w:t xml:space="preserve"> laiks nedrīkst pārsniegt 3 sekundes, un datu apstrādei jānotiek bez aiztures.</w:t>
+        <w:t>Sistēmai jānodrošina ātra reakcija uz lietotāja darbībām, lapu ielādes laiks nedrīkst pārsniegt 3 sekundes, un datu apstrādei jānotiek bez aiztures.</w:t>
       </w:r>
     </w:p>
     <w:p>
@@ -9525,15 +9016,7 @@
     </w:p>
     <w:p>
       <w:r>
-        <w:t xml:space="preserve">Sistēmai jābūt viegli lietojamai, ar intuitīvu </w:t>
-      </w:r>
-      <w:proofErr w:type="spellStart"/>
-      <w:r>
-        <w:t>saskarni</w:t>
-      </w:r>
-      <w:proofErr w:type="spellEnd"/>
-      <w:r>
-        <w:t xml:space="preserve"> un skaidru navigāciju, lai lietotājs varētu veikt jebkuru darbību ne vairāk kā trīs soļos.</w:t>
+        <w:t>Sistēmai jābūt viegli lietojamai, ar intuitīvu saskarni un skaidru navigāciju, lai lietotājs varētu veikt jebkuru darbību ne vairāk kā trīs soļos.</w:t>
       </w:r>
     </w:p>
     <w:p>
@@ -9558,37 +9041,8 @@
     </w:p>
     <w:p>
       <w:r>
-        <w:t xml:space="preserve">Sistēmai jābūt pilnībā saderīgai ar populārākajām pārlūkprogrammām — Google </w:t>
-      </w:r>
-      <w:proofErr w:type="spellStart"/>
-      <w:r>
-        <w:t>Chrome</w:t>
-      </w:r>
-      <w:proofErr w:type="spellEnd"/>
-      <w:r>
-        <w:t xml:space="preserve">, </w:t>
-      </w:r>
-      <w:proofErr w:type="spellStart"/>
-      <w:r>
-        <w:t>Mozilla</w:t>
-      </w:r>
-      <w:proofErr w:type="spellEnd"/>
-      <w:r>
-        <w:t xml:space="preserve"> </w:t>
-      </w:r>
-      <w:proofErr w:type="spellStart"/>
-      <w:r>
-        <w:t>Firefox</w:t>
-      </w:r>
-      <w:proofErr w:type="spellEnd"/>
-      <w:r>
-        <w:t xml:space="preserve"> un Microsoft </w:t>
-      </w:r>
-      <w:proofErr w:type="spellStart"/>
-      <w:r>
-        <w:t>Edge.</w:t>
-      </w:r>
-      <w:proofErr w:type="spellEnd"/>
+        <w:t>Sistēmai jābūt pilnībā saderīgai ar populārākajām pārlūkprogrammām — Google Chrome, Mozilla Firefox un Microsoft Edge.</w:t>
+      </w:r>
     </w:p>
     <w:p>
       <w:pPr>
@@ -9602,7 +9056,6 @@
           <w:bCs/>
         </w:rPr>
       </w:pPr>
-      <w:proofErr w:type="spellStart"/>
       <w:r>
         <w:rPr>
           <w:b/>
@@ -9610,7 +9063,6 @@
         </w:rPr>
         <w:t>Uzturējamība</w:t>
       </w:r>
-      <w:proofErr w:type="spellEnd"/>
     </w:p>
     <w:p>
       <w:r>
@@ -10066,15 +9518,7 @@
         <w:t xml:space="preserve">Priekšrocības: </w:t>
       </w:r>
       <w:r>
-        <w:t xml:space="preserve">Vienkārša un plaši atbalstīta valoda. Nodrošina saderību ar visām pārlūkprogrammām. Ļauj viegli integrēt CSS un </w:t>
-      </w:r>
-      <w:proofErr w:type="spellStart"/>
-      <w:r>
-        <w:t>JavaScript</w:t>
-      </w:r>
-      <w:proofErr w:type="spellEnd"/>
-      <w:r>
-        <w:t xml:space="preserve"> funkcionalitāti.</w:t>
+        <w:t>Vienkārša un plaši atbalstīta valoda. Nodrošina saderību ar visām pārlūkprogrammām. Ļauj viegli integrēt CSS un JavaScript funkcionalitāti.</w:t>
       </w:r>
     </w:p>
     <w:p>
@@ -10093,15 +9537,7 @@
         <w:t>Trūkumi:</w:t>
       </w:r>
       <w:r>
-        <w:t xml:space="preserve"> Vien ar HTML nevar nodrošināt </w:t>
-      </w:r>
-      <w:proofErr w:type="spellStart"/>
-      <w:r>
-        <w:t>interaktivitāti</w:t>
-      </w:r>
-      <w:proofErr w:type="spellEnd"/>
-      <w:r>
-        <w:t xml:space="preserve"> vai datu apstrādi. Ierobežota iespēja veidot dinamisku saturu bez citu valodu palīdzības.</w:t>
+        <w:t xml:space="preserve"> Vien ar HTML nevar nodrošināt interaktivitāti vai datu apstrādi. Ierobežota iespēja veidot dinamisku saturu bez citu valodu palīdzības.</w:t>
       </w:r>
     </w:p>
     <w:p>
@@ -10132,15 +9568,7 @@
         <w:t>Kāpēc izmantots:</w:t>
       </w:r>
       <w:r>
-        <w:t xml:space="preserve"> CSS nodrošina iespēju izveidot mūsdienīgu, estētisku un lietotājam draudzīgu </w:t>
-      </w:r>
-      <w:proofErr w:type="spellStart"/>
-      <w:r>
-        <w:t>saskarni</w:t>
-      </w:r>
-      <w:proofErr w:type="spellEnd"/>
-      <w:r>
-        <w:t>, pielāgojot dizainu dažādām ierīcēm.</w:t>
+        <w:t xml:space="preserve"> CSS nodrošina iespēju izveidot mūsdienīgu, estētisku un lietotājam draudzīgu saskarni, pielāgojot dizainu dažādām ierīcēm.</w:t>
       </w:r>
     </w:p>
     <w:p>
@@ -10159,15 +9587,7 @@
         <w:t xml:space="preserve">Priekšrocības: </w:t>
       </w:r>
       <w:r>
-        <w:t xml:space="preserve">Nodala dizainu no satura, atvieglojot uzturēšanu. Ļauj ātri veikt dizaina izmaiņas visā sistēmā. Atbalsta </w:t>
-      </w:r>
-      <w:proofErr w:type="spellStart"/>
-      <w:r>
-        <w:t>responsīvu</w:t>
-      </w:r>
-      <w:proofErr w:type="spellEnd"/>
-      <w:r>
-        <w:t xml:space="preserve"> dizainu mobilajām ierīcēm.</w:t>
+        <w:t>Nodala dizainu no satura, atvieglojot uzturēšanu. Ļauj ātri veikt dizaina izmaiņas visā sistēmā. Atbalsta responsīvu dizainu mobilajām ierīcēm.</w:t>
       </w:r>
     </w:p>
     <w:p>
@@ -10190,7 +9610,6 @@
       </w:r>
     </w:p>
     <w:p>
-      <w:proofErr w:type="spellStart"/>
       <w:r>
         <w:rPr>
           <w:b/>
@@ -10198,7 +9617,6 @@
         </w:rPr>
         <w:t>JavaScript</w:t>
       </w:r>
-      <w:proofErr w:type="spellEnd"/>
       <w:r>
         <w:rPr>
           <w:b/>
@@ -10207,15 +9625,7 @@
         <w:t xml:space="preserve"> </w:t>
       </w:r>
       <w:r>
-        <w:t xml:space="preserve">– programmēšanas valoda, kas piešķir tīmekļa lapām </w:t>
-      </w:r>
-      <w:proofErr w:type="spellStart"/>
-      <w:r>
-        <w:t>interaktivitāti</w:t>
-      </w:r>
-      <w:proofErr w:type="spellEnd"/>
-      <w:r>
-        <w:t xml:space="preserve"> un dinamisku uzvedību.</w:t>
+        <w:t>– programmēšanas valoda, kas piešķir tīmekļa lapām interaktivitāti un dinamisku uzvedību.</w:t>
       </w:r>
     </w:p>
     <w:p>
@@ -10234,15 +9644,7 @@
         <w:t>Kāpēc izmantots:</w:t>
       </w:r>
       <w:r>
-        <w:t xml:space="preserve"> Tā ļauj sistēmai reaģēt uz lietotāja darbībām, veikt datu validāciju, mainīt saturu bez lapas </w:t>
-      </w:r>
-      <w:proofErr w:type="spellStart"/>
-      <w:r>
-        <w:t>pārlādes</w:t>
-      </w:r>
-      <w:proofErr w:type="spellEnd"/>
-      <w:r>
-        <w:t xml:space="preserve"> un nodrošina patīkamu lietotāja pieredzi.</w:t>
+        <w:t xml:space="preserve"> Tā ļauj sistēmai reaģēt uz lietotāja darbībām, veikt datu validāciju, mainīt saturu bez lapas pārlādes un nodrošina patīkamu lietotāja pieredzi.</w:t>
       </w:r>
     </w:p>
     <w:p>
@@ -10261,15 +9663,7 @@
         <w:t xml:space="preserve">Priekšrocības: </w:t>
       </w:r>
       <w:r>
-        <w:t xml:space="preserve">Nodrošina dinamisku un interaktīvu </w:t>
-      </w:r>
-      <w:proofErr w:type="spellStart"/>
-      <w:r>
-        <w:t>saskarni</w:t>
-      </w:r>
-      <w:proofErr w:type="spellEnd"/>
-      <w:r>
-        <w:t>. Plašs bibliotēku un rīku klāsts. Ātra izpilde pārlūkprogrammā.</w:t>
+        <w:t>Nodrošina dinamisku un interaktīvu saskarni. Plašs bibliotēku un rīku klāsts. Ātra izpilde pārlūkprogrammā.</w:t>
       </w:r>
     </w:p>
     <w:p>
@@ -10339,15 +9733,7 @@
         <w:t xml:space="preserve">Priekšrocības: </w:t>
       </w:r>
       <w:r>
-        <w:t xml:space="preserve">Ērta integrācija ar datubāzēm (piemēram, </w:t>
-      </w:r>
-      <w:proofErr w:type="spellStart"/>
-      <w:r>
-        <w:t>MySQL</w:t>
-      </w:r>
-      <w:proofErr w:type="spellEnd"/>
-      <w:r>
-        <w:t>). Labi piemērota servera puses loģikas izstrādei. Plaša kopiena un daudz gatavu risinājumu.</w:t>
+        <w:t>Ērta integrācija ar datubāzēm (piemēram, MySQL). Labi piemērota servera puses loģikas izstrādei. Plaša kopiena un daudz gatavu risinājumu.</w:t>
       </w:r>
     </w:p>
     <w:p>
@@ -10370,7 +9756,6 @@
       </w:r>
     </w:p>
     <w:p>
-      <w:proofErr w:type="spellStart"/>
       <w:r>
         <w:rPr>
           <w:b/>
@@ -10378,17 +9763,8 @@
         </w:rPr>
         <w:t>phpMyAdmin</w:t>
       </w:r>
-      <w:proofErr w:type="spellEnd"/>
-      <w:r>
-        <w:t xml:space="preserve"> – relāciju </w:t>
-      </w:r>
-      <w:proofErr w:type="spellStart"/>
-      <w:r>
-        <w:t>datubāzu</w:t>
-      </w:r>
-      <w:proofErr w:type="spellEnd"/>
-      <w:r>
-        <w:t xml:space="preserve"> pārvaldības sistēma, kas tiek izmantota datu glabāšanai un apstrādei.</w:t>
+      <w:r>
+        <w:t xml:space="preserve"> – relāciju datubāzu pārvaldības sistēma, kas tiek izmantota datu glabāšanai un apstrādei.</w:t>
       </w:r>
     </w:p>
     <w:p>
@@ -10449,7 +9825,6 @@
       </w:r>
     </w:p>
     <w:p>
-      <w:proofErr w:type="spellStart"/>
       <w:r>
         <w:rPr>
           <w:b/>
@@ -10457,28 +9832,11 @@
         </w:rPr>
         <w:t>GitHub</w:t>
       </w:r>
-      <w:proofErr w:type="spellEnd"/>
       <w:r>
         <w:t xml:space="preserve"> – </w:t>
       </w:r>
       <w:r>
-        <w:t xml:space="preserve">platforma versiju kontroles un sadarbības nodrošināšanai, kas balstīta uz </w:t>
-      </w:r>
-      <w:proofErr w:type="spellStart"/>
-      <w:r>
-        <w:t>Git</w:t>
-      </w:r>
-      <w:proofErr w:type="spellEnd"/>
-      <w:r>
-        <w:t xml:space="preserve"> sistēmu. Tā ļauj saglabāt projekta failus </w:t>
-      </w:r>
-      <w:proofErr w:type="spellStart"/>
-      <w:r>
-        <w:t>mākoņvidē</w:t>
-      </w:r>
-      <w:proofErr w:type="spellEnd"/>
-      <w:r>
-        <w:t>, izsekot izmaiņām un sadarboties ar citiem izstrādātājiem.</w:t>
+        <w:t>platforma versiju kontroles un sadarbības nodrošināšanai, kas balstīta uz Git sistēmu. Tā ļauj saglabāt projekta failus mākoņvidē, izsekot izmaiņām un sadarboties ar citiem izstrādātājiem.</w:t>
       </w:r>
     </w:p>
     <w:p>
@@ -10497,15 +9855,7 @@
         <w:t>Kāpēc izmantots:</w:t>
       </w:r>
       <w:r>
-        <w:t xml:space="preserve"> </w:t>
-      </w:r>
-      <w:proofErr w:type="spellStart"/>
-      <w:r>
-        <w:t>GitHub</w:t>
-      </w:r>
-      <w:proofErr w:type="spellEnd"/>
-      <w:r>
-        <w:t xml:space="preserve"> tika izmantots, lai droši glabātu projekta pirmkodu, izsekotu izmaiņām un nodrošinātu iespēju viegli atgriezties pie iepriekšējām versijām. Tas arī atvieglo projekta prezentēšanu un publicēšanu.</w:t>
+        <w:t xml:space="preserve"> GitHub tika izmantots, lai droši glabātu projekta pirmkodu, izsekotu izmaiņām un nodrošinātu iespēju viegli atgriezties pie iepriekšējām versijām. Tas arī atvieglo projekta prezentēšanu un publicēšanu.</w:t>
       </w:r>
     </w:p>
     <w:p>
@@ -10530,23 +9880,7 @@
         <w:t xml:space="preserve"> </w:t>
       </w:r>
       <w:r>
-        <w:t xml:space="preserve">Ērta integrācija ar </w:t>
-      </w:r>
-      <w:proofErr w:type="spellStart"/>
-      <w:r>
-        <w:t>Visual</w:t>
-      </w:r>
-      <w:proofErr w:type="spellEnd"/>
-      <w:r>
-        <w:t xml:space="preserve"> </w:t>
-      </w:r>
-      <w:proofErr w:type="spellStart"/>
-      <w:r>
-        <w:t>Studio</w:t>
-      </w:r>
-      <w:proofErr w:type="spellEnd"/>
-      <w:r>
-        <w:t xml:space="preserve"> Code.</w:t>
+        <w:t>Ērta integrācija ar Visual Studio Code.</w:t>
       </w:r>
     </w:p>
     <w:p>
@@ -10565,41 +9899,23 @@
         <w:t>Trūkumi:</w:t>
       </w:r>
       <w:r>
-        <w:t xml:space="preserve"> Nepieciešamas </w:t>
-      </w:r>
-      <w:proofErr w:type="spellStart"/>
-      <w:r>
-        <w:t>pamatzināšanas</w:t>
-      </w:r>
-      <w:proofErr w:type="spellEnd"/>
-      <w:r>
-        <w:t xml:space="preserve"> par </w:t>
-      </w:r>
-      <w:proofErr w:type="spellStart"/>
-      <w:r>
-        <w:t>Git</w:t>
-      </w:r>
-      <w:proofErr w:type="spellEnd"/>
-      <w:r>
-        <w:t xml:space="preserve"> komandām. </w:t>
-      </w:r>
-    </w:p>
-    <w:p>
-      <w:pPr>
-        <w:rPr>
-          <w:b/>
-          <w:bCs/>
-        </w:rPr>
-      </w:pPr>
-      <w:proofErr w:type="spellStart"/>
-      <w:r>
-        <w:rPr>
-          <w:b/>
-          <w:bCs/>
-        </w:rPr>
-        <w:t>Visual</w:t>
-      </w:r>
-      <w:proofErr w:type="spellEnd"/>
+        <w:t xml:space="preserve"> Nepieciešamas pamatzināšanas par Git komandām. </w:t>
+      </w:r>
+    </w:p>
+    <w:p>
+      <w:pPr>
+        <w:rPr>
+          <w:b/>
+          <w:bCs/>
+        </w:rPr>
+      </w:pPr>
+      <w:r>
+        <w:rPr>
+          <w:b/>
+          <w:bCs/>
+        </w:rPr>
+        <w:t>Visual Studio Code (VS Code)</w:t>
+      </w:r>
       <w:r>
         <w:rPr>
           <w:b/>
@@ -10607,21 +9923,8 @@
         </w:rPr>
         <w:t xml:space="preserve"> </w:t>
       </w:r>
-      <w:proofErr w:type="spellStart"/>
-      <w:r>
-        <w:rPr>
-          <w:b/>
-          <w:bCs/>
-        </w:rPr>
-        <w:t>Studio</w:t>
-      </w:r>
-      <w:proofErr w:type="spellEnd"/>
-      <w:r>
-        <w:rPr>
-          <w:b/>
-          <w:bCs/>
-        </w:rPr>
-        <w:t xml:space="preserve"> Code (VS Code)</w:t>
+      <w:r>
+        <w:t xml:space="preserve">– </w:t>
       </w:r>
       <w:r>
         <w:rPr>
@@ -10631,25 +9934,7 @@
         <w:t xml:space="preserve"> </w:t>
       </w:r>
       <w:r>
-        <w:t xml:space="preserve">– </w:t>
-      </w:r>
-      <w:r>
-        <w:rPr>
-          <w:b/>
-          <w:bCs/>
-        </w:rPr>
-        <w:t xml:space="preserve"> </w:t>
-      </w:r>
-      <w:r>
-        <w:t xml:space="preserve">bezmaksas un atvērtā koda programmēšanas vide, ko izstrādājusi Microsoft. Tā paredzēta dažādu programmēšanas valodu, tostarp HTML, CSS, </w:t>
-      </w:r>
-      <w:proofErr w:type="spellStart"/>
-      <w:r>
-        <w:t>JavaScript</w:t>
-      </w:r>
-      <w:proofErr w:type="spellEnd"/>
-      <w:r>
-        <w:t xml:space="preserve"> un PHP, rediģēšanai un testēšanai.</w:t>
+        <w:t>bezmaksas un atvērtā koda programmēšanas vide, ko izstrādājusi Microsoft. Tā paredzēta dažādu programmēšanas valodu, tostarp HTML, CSS, JavaScript un PHP, rediģēšanai un testēšanai.</w:t>
       </w:r>
     </w:p>
     <w:p>
@@ -10668,15 +9953,7 @@
         <w:t>Kāpēc izmantots:</w:t>
       </w:r>
       <w:r>
-        <w:t xml:space="preserve"> VS Code nodrošina ērtu darba vidi ar plašu paplašinājumu klāstu, sintakses izcelšanu, kļūdu pārbaudi un </w:t>
-      </w:r>
-      <w:proofErr w:type="spellStart"/>
-      <w:r>
-        <w:t>Git</w:t>
-      </w:r>
-      <w:proofErr w:type="spellEnd"/>
-      <w:r>
-        <w:t xml:space="preserve"> integrāciju. Tā ir ideāli piemērota tīmekļa izstrādei, nodrošinot ātru un efektīvu kodēšanu.</w:t>
+        <w:t xml:space="preserve"> VS Code nodrošina ērtu darba vidi ar plašu paplašinājumu klāstu, sintakses izcelšanu, kļūdu pārbaudi un Git integrāciju. Tā ir ideāli piemērota tīmekļa izstrādei, nodrošinot ātru un efektīvu kodēšanu.</w:t>
       </w:r>
     </w:p>
     <w:p>
@@ -10696,23 +9973,7 @@
         <w:t xml:space="preserve">Priekšrocības: </w:t>
       </w:r>
       <w:r>
-        <w:t xml:space="preserve">Viegls un ātrs redaktors ar plašu funkcionalitāti. Iebūvēta </w:t>
-      </w:r>
-      <w:proofErr w:type="spellStart"/>
-      <w:r>
-        <w:t>Git</w:t>
-      </w:r>
-      <w:proofErr w:type="spellEnd"/>
-      <w:r>
-        <w:t xml:space="preserve"> un </w:t>
-      </w:r>
-      <w:proofErr w:type="spellStart"/>
-      <w:r>
-        <w:t>GitHub</w:t>
-      </w:r>
-      <w:proofErr w:type="spellEnd"/>
-      <w:r>
-        <w:t xml:space="preserve"> integrācija. Daudz pieejamu paplašinājumu un tēmu. Ērta kļūdu pārbaude un automātiskā formatēšana.</w:t>
+        <w:t>Viegls un ātrs redaktors ar plašu funkcionalitāti. Iebūvēta Git un GitHub integrācija. Daudz pieejamu paplašinājumu un tēmu. Ērta kļūdu pārbaude un automātiskā formatēšana.</w:t>
       </w:r>
     </w:p>
     <w:p>
@@ -10750,19 +10011,10 @@
     </w:p>
     <w:p>
       <w:r>
-        <w:t xml:space="preserve">Alternatīvi risinājumi ietver citas programmēšanas valodas un </w:t>
-      </w:r>
-      <w:proofErr w:type="spellStart"/>
-      <w:r>
-        <w:t>izstrades</w:t>
-      </w:r>
-      <w:proofErr w:type="spellEnd"/>
-      <w:r>
-        <w:t xml:space="preserve"> rīkus, kas var tikt izmantoti līdzīga veida projektos:</w:t>
-      </w:r>
-    </w:p>
-    <w:p>
-      <w:proofErr w:type="spellStart"/>
+        <w:t>Alternatīvi risinājumi ietver citas programmēšanas valodas un izstrades rīkus, kas var tikt izmantoti līdzīga veida projektos:</w:t>
+      </w:r>
+    </w:p>
+    <w:p>
       <w:r>
         <w:rPr>
           <w:b/>
@@ -10770,7 +10022,6 @@
         </w:rPr>
         <w:t>Back-end</w:t>
       </w:r>
-      <w:proofErr w:type="spellEnd"/>
       <w:r>
         <w:t xml:space="preserve"> alternatīvas:</w:t>
       </w:r>
@@ -10783,46 +10034,16 @@
           <w:numId w:val="33"/>
         </w:numPr>
       </w:pPr>
-      <w:proofErr w:type="spellStart"/>
-      <w:r>
-        <w:rPr>
-          <w:b/>
-          <w:bCs/>
-        </w:rPr>
-        <w:t>Python</w:t>
-      </w:r>
-      <w:proofErr w:type="spellEnd"/>
-      <w:r>
-        <w:rPr>
-          <w:b/>
-          <w:bCs/>
-        </w:rPr>
-        <w:t xml:space="preserve"> (</w:t>
-      </w:r>
-      <w:proofErr w:type="spellStart"/>
-      <w:r>
-        <w:rPr>
-          <w:b/>
-          <w:bCs/>
-        </w:rPr>
-        <w:t>Django</w:t>
-      </w:r>
-      <w:proofErr w:type="spellEnd"/>
-      <w:r>
-        <w:rPr>
-          <w:b/>
-          <w:bCs/>
-        </w:rPr>
-        <w:t xml:space="preserve">) – </w:t>
+      <w:r>
+        <w:rPr>
+          <w:b/>
+          <w:bCs/>
+        </w:rPr>
+        <w:t xml:space="preserve">Python (Django) – </w:t>
       </w:r>
       <w:bookmarkStart w:id="12" w:name="_Toc212467039"/>
-      <w:proofErr w:type="spellStart"/>
-      <w:r>
-        <w:t>Python</w:t>
-      </w:r>
-      <w:proofErr w:type="spellEnd"/>
-      <w:r>
-        <w:t xml:space="preserve"> ietvars, kas paredzēts tīmekļa lietotņu izstrādei, nodrošinot daudzus gatavus risinājumus drošībai un datu pārvaldībai.</w:t>
+      <w:r>
+        <w:t>Python ietvars, kas paredzēts tīmekļa lietotņu izstrādei, nodrošinot daudzus gatavus risinājumus drošībai un datu pārvaldībai.</w:t>
       </w:r>
     </w:p>
     <w:p>
@@ -10848,27 +10069,10 @@
         <w:t xml:space="preserve">: </w:t>
       </w:r>
       <w:r>
-        <w:t xml:space="preserve">Lai gan </w:t>
-      </w:r>
-      <w:proofErr w:type="spellStart"/>
-      <w:r>
-        <w:t>Django</w:t>
-      </w:r>
-      <w:proofErr w:type="spellEnd"/>
-      <w:r>
-        <w:t xml:space="preserve"> piedāvā augstu drošības līmeni, tā apguve un ieviešana prasītu vairāk laika. Projekta mērķis ir izstrādāt vieglu un ātru tīmekļa sistēmu, ko efektīvāk nodrošina PHP un </w:t>
-      </w:r>
-      <w:proofErr w:type="spellStart"/>
-      <w:r>
-        <w:t>MySQL</w:t>
-      </w:r>
-      <w:proofErr w:type="spellEnd"/>
-      <w:r>
-        <w:t xml:space="preserve"> kombinācija.</w:t>
-      </w:r>
-    </w:p>
-    <w:p>
-      <w:proofErr w:type="spellStart"/>
+        <w:t>Lai gan Django piedāvā augstu drošības līmeni, tā apguve un ieviešana prasītu vairāk laika. Projekta mērķis ir izstrādāt vieglu un ātru tīmekļa sistēmu, ko efektīvāk nodrošina PHP un MySQL kombinācija.</w:t>
+      </w:r>
+    </w:p>
+    <w:p>
       <w:r>
         <w:rPr>
           <w:b/>
@@ -10883,7 +10087,6 @@
         </w:rPr>
         <w:t>-end</w:t>
       </w:r>
-      <w:proofErr w:type="spellEnd"/>
       <w:r>
         <w:t xml:space="preserve"> alternatīvas:</w:t>
       </w:r>
@@ -10903,13 +10106,8 @@
         </w:rPr>
         <w:t xml:space="preserve">Node.js – </w:t>
       </w:r>
-      <w:proofErr w:type="spellStart"/>
-      <w:r>
-        <w:t>JavaScript</w:t>
-      </w:r>
-      <w:proofErr w:type="spellEnd"/>
-      <w:r>
-        <w:t xml:space="preserve"> izpildes vide servera pusē, kas ļauj veidot ātras un mērogojamas lietotnes.</w:t>
+      <w:r>
+        <w:t>JavaScript izpildes vide servera pusē, kas ļauj veidot ātras un mērogojamas lietotnes.</w:t>
       </w:r>
     </w:p>
     <w:p>
@@ -10935,33 +10133,16 @@
         <w:t xml:space="preserve">: </w:t>
       </w:r>
       <w:r>
-        <w:t xml:space="preserve">Projekta mērķis ir izstrādāt nelielu tīmekļa sistēmu ar vienkāršu datu apstrādi, ko efektīvi nodrošina PHP un </w:t>
-      </w:r>
-      <w:proofErr w:type="spellStart"/>
-      <w:r>
-        <w:t>MySQL</w:t>
-      </w:r>
-      <w:proofErr w:type="spellEnd"/>
-      <w:r>
-        <w:t>. Node.js prasītu sarežģītāku infrastruktūru un papildu servera konfigurāciju.</w:t>
-      </w:r>
-    </w:p>
-    <w:p>
-      <w:proofErr w:type="spellStart"/>
-      <w:r>
-        <w:rPr>
-          <w:b/>
-          <w:bCs/>
-        </w:rPr>
-        <w:t>Datubāzu</w:t>
-      </w:r>
-      <w:proofErr w:type="spellEnd"/>
-      <w:r>
-        <w:rPr>
-          <w:b/>
-          <w:bCs/>
-        </w:rPr>
-        <w:t xml:space="preserve"> </w:t>
+        <w:t>Projekta mērķis ir izstrādāt nelielu tīmekļa sistēmu ar vienkāršu datu apstrādi, ko efektīvi nodrošina PHP un MySQL. Node.js prasītu sarežģītāku infrastruktūru un papildu servera konfigurāciju.</w:t>
+      </w:r>
+    </w:p>
+    <w:p>
+      <w:r>
+        <w:rPr>
+          <w:b/>
+          <w:bCs/>
+        </w:rPr>
+        <w:t xml:space="preserve">Datubāzu </w:t>
       </w:r>
       <w:r>
         <w:t>alternatīvas:</w:t>
@@ -10979,7 +10160,6 @@
           <w:bCs/>
         </w:rPr>
       </w:pPr>
-      <w:proofErr w:type="spellStart"/>
       <w:r>
         <w:rPr>
           <w:b/>
@@ -10987,7 +10167,6 @@
         </w:rPr>
         <w:t>PostgreSQL</w:t>
       </w:r>
-      <w:proofErr w:type="spellEnd"/>
       <w:r>
         <w:rPr>
           <w:b/>
@@ -10996,15 +10175,7 @@
         <w:t xml:space="preserve"> – </w:t>
       </w:r>
       <w:r>
-        <w:t xml:space="preserve">atvērtā koda relāciju </w:t>
-      </w:r>
-      <w:proofErr w:type="spellStart"/>
-      <w:r>
-        <w:t>datubāzu</w:t>
-      </w:r>
-      <w:proofErr w:type="spellEnd"/>
-      <w:r>
-        <w:t xml:space="preserve"> pārvaldības sistēma ar uzlabotām funkcijām, piemēram, sarežģītu datu tipu atbalstu un augstu transakciju drošību.</w:t>
+        <w:t>atvērtā koda relāciju datubāzu pārvaldības sistēma ar uzlabotām funkcijām, piemēram, sarežģītu datu tipu atbalstu un augstu transakciju drošību.</w:t>
       </w:r>
     </w:p>
     <w:p>
@@ -11023,39 +10194,7 @@
         <w:t xml:space="preserve">Kāpēc nav izmantots: </w:t>
       </w:r>
       <w:r>
-        <w:t xml:space="preserve">Projekta mērogs neprasa </w:t>
-      </w:r>
-      <w:proofErr w:type="spellStart"/>
-      <w:r>
-        <w:t>PostgreSQL</w:t>
-      </w:r>
-      <w:proofErr w:type="spellEnd"/>
-      <w:r>
-        <w:t xml:space="preserve"> sniegtās uzlabotās iespējas. </w:t>
-      </w:r>
-      <w:proofErr w:type="spellStart"/>
-      <w:r>
-        <w:t>MySQL</w:t>
-      </w:r>
-      <w:proofErr w:type="spellEnd"/>
-      <w:r>
-        <w:t xml:space="preserve"> nodrošina pietiekamu veiktspēju, vieglu konfigurāciju un labāku saderību ar PHP. </w:t>
-      </w:r>
-      <w:proofErr w:type="spellStart"/>
-      <w:r>
-        <w:t>PostgreSQL</w:t>
-      </w:r>
-      <w:proofErr w:type="spellEnd"/>
-      <w:r>
-        <w:t xml:space="preserve"> būtu piemērotāks lielākiem un </w:t>
-      </w:r>
-      <w:proofErr w:type="spellStart"/>
-      <w:r>
-        <w:t>resursietilpīgākiem</w:t>
-      </w:r>
-      <w:proofErr w:type="spellEnd"/>
-      <w:r>
-        <w:t xml:space="preserve"> projektiem.</w:t>
+        <w:t>Projekta mērogs neprasa PostgreSQL sniegtās uzlabotās iespējas. MySQL nodrošina pietiekamu veiktspēju, vieglu konfigurāciju un labāku saderību ar PHP. PostgreSQL būtu piemērotāks lielākiem un resursietilpīgākiem projektiem.</w:t>
       </w:r>
     </w:p>
     <w:p>
@@ -11082,7 +10221,6 @@
           <w:bCs/>
         </w:rPr>
       </w:pPr>
-      <w:proofErr w:type="spellStart"/>
       <w:r>
         <w:rPr>
           <w:b/>
@@ -11090,7 +10228,6 @@
         </w:rPr>
         <w:t>PhpStorm</w:t>
       </w:r>
-      <w:proofErr w:type="spellEnd"/>
       <w:r>
         <w:rPr>
           <w:b/>
@@ -11121,30 +10258,12 @@
         </w:rPr>
         <w:t xml:space="preserve">Kāpēc nav izmantots: </w:t>
       </w:r>
-      <w:proofErr w:type="spellStart"/>
-      <w:r>
-        <w:t>PhpStorm</w:t>
-      </w:r>
-      <w:proofErr w:type="spellEnd"/>
-      <w:r>
-        <w:t xml:space="preserve"> ir lielisks, taču maksas rīks, kas piedāvā funkcijas, kuras šī projekta mērogā nav kritiski nepieciešamas. </w:t>
-      </w:r>
-      <w:proofErr w:type="spellStart"/>
-      <w:r>
-        <w:t>Visual</w:t>
-      </w:r>
-      <w:proofErr w:type="spellEnd"/>
-      <w:r>
-        <w:t xml:space="preserve"> </w:t>
-      </w:r>
-      <w:proofErr w:type="spellStart"/>
+      <w:r>
+        <w:t xml:space="preserve">PhpStorm ir lielisks, taču maksas rīks, kas piedāvā funkcijas, kuras šī projekta mērogā nav kritiski nepieciešamas. Visual </w:t>
+      </w:r>
       <w:r>
         <w:lastRenderedPageBreak/>
-        <w:t>Studio</w:t>
-      </w:r>
-      <w:proofErr w:type="spellEnd"/>
-      <w:r>
-        <w:t xml:space="preserve"> Code ir bezmaksas, viegls un ar pietiekamām iespējām šāda veida projektiem, īpaši ar paplašinājumiem.</w:t>
+        <w:t>Studio Code ir bezmaksas, viegls un ar pietiekamām iespējām šāda veida projektiem, īpaši ar paplašinājumiem.</w:t>
       </w:r>
     </w:p>
     <w:p>
@@ -11156,10 +10275,7 @@
         <w:t>Versiju kontroles</w:t>
       </w:r>
       <w:r>
-        <w:t xml:space="preserve"> alternatīva</w:t>
-      </w:r>
-      <w:r>
-        <w:t>s:</w:t>
+        <w:t xml:space="preserve"> alternatīvas:</w:t>
       </w:r>
     </w:p>
     <w:p>
@@ -11174,64 +10290,15 @@
           <w:bCs/>
         </w:rPr>
       </w:pPr>
-      <w:proofErr w:type="spellStart"/>
-      <w:r>
-        <w:rPr>
-          <w:b/>
-          <w:bCs/>
-        </w:rPr>
-        <w:t>GitLab</w:t>
-      </w:r>
-      <w:proofErr w:type="spellEnd"/>
-      <w:r>
-        <w:rPr>
-          <w:b/>
-          <w:bCs/>
-        </w:rPr>
-        <w:t xml:space="preserve"> – </w:t>
-      </w:r>
-      <w:r>
-        <w:t xml:space="preserve">versiju kontroles platforma līdzīga </w:t>
-      </w:r>
-      <w:proofErr w:type="spellStart"/>
-      <w:r>
-        <w:t>GitHub</w:t>
-      </w:r>
-      <w:proofErr w:type="spellEnd"/>
-      <w:r>
-        <w:t>, kas piedāvā arī iebūvētu CI/CD (</w:t>
-      </w:r>
-      <w:proofErr w:type="spellStart"/>
-      <w:r>
-        <w:t>Continuous</w:t>
-      </w:r>
-      <w:proofErr w:type="spellEnd"/>
-      <w:r>
-        <w:t xml:space="preserve"> </w:t>
-      </w:r>
-      <w:proofErr w:type="spellStart"/>
-      <w:r>
-        <w:t>Integration</w:t>
-      </w:r>
-      <w:proofErr w:type="spellEnd"/>
-      <w:r>
-        <w:t xml:space="preserve"> / </w:t>
-      </w:r>
-      <w:proofErr w:type="spellStart"/>
-      <w:r>
-        <w:t>Continuous</w:t>
-      </w:r>
-      <w:proofErr w:type="spellEnd"/>
-      <w:r>
-        <w:t xml:space="preserve"> </w:t>
-      </w:r>
-      <w:proofErr w:type="spellStart"/>
-      <w:r>
-        <w:t>Deployment</w:t>
-      </w:r>
-      <w:proofErr w:type="spellEnd"/>
-      <w:r>
-        <w:t>) funkcionalitāti.</w:t>
+      <w:r>
+        <w:rPr>
+          <w:b/>
+          <w:bCs/>
+        </w:rPr>
+        <w:t xml:space="preserve">GitLab – </w:t>
+      </w:r>
+      <w:r>
+        <w:t>versiju kontroles platforma līdzīga GitHub, kas piedāvā arī iebūvētu CI/CD (Continuous Integration / Continuous Deployment) funkcionalitāti.</w:t>
       </w:r>
     </w:p>
     <w:p>
@@ -11253,40 +10320,11 @@
         </w:rPr>
         <w:t xml:space="preserve">Kāpēc nav izmantots: </w:t>
       </w:r>
-      <w:proofErr w:type="spellStart"/>
-      <w:r>
-        <w:t>GitLab</w:t>
-      </w:r>
-      <w:proofErr w:type="spellEnd"/>
-      <w:r>
-        <w:t xml:space="preserve"> ir vairāk piemērots lieliem </w:t>
-      </w:r>
-      <w:proofErr w:type="spellStart"/>
-      <w:r>
-        <w:t>komandprojektiem</w:t>
-      </w:r>
-      <w:proofErr w:type="spellEnd"/>
-      <w:r>
-        <w:t xml:space="preserve"> </w:t>
-      </w:r>
-      <w:r>
-        <w:t xml:space="preserve">un prasa papildu servera resursus, ja izmanto </w:t>
-      </w:r>
-      <w:proofErr w:type="spellStart"/>
-      <w:r>
-        <w:t>pašmitināto</w:t>
-      </w:r>
-      <w:proofErr w:type="spellEnd"/>
-      <w:r>
-        <w:t xml:space="preserve"> versiju. </w:t>
-      </w:r>
-      <w:proofErr w:type="spellStart"/>
-      <w:r>
-        <w:t>GitHub</w:t>
-      </w:r>
-      <w:proofErr w:type="spellEnd"/>
-      <w:r>
-        <w:t xml:space="preserve"> ir vienkāršāks, pieejamāks un pietiekami funkcionāls individuālam projektam.</w:t>
+      <w:r>
+        <w:t>GitLab ir vairāk piemērots lieliem komandprojektiem</w:t>
+      </w:r>
+      <w:r>
+        <w:t xml:space="preserve"> un prasa papildu servera resursus, ja izmanto pašmitināto versiju. GitHub ir vienkāršāks, pieejamāks un pietiekami funkcionāls individuālam projektam.</w:t>
       </w:r>
     </w:p>
     <w:p>
@@ -11366,31 +10404,7 @@
       </w:pPr>
       <w:bookmarkStart w:id="17" w:name="_Toc212467044"/>
       <w:r>
-        <w:t xml:space="preserve">4.2.1. </w:t>
-      </w:r>
-      <w:proofErr w:type="spellStart"/>
-      <w:r>
-        <w:t>Lietojumgadījumu</w:t>
-      </w:r>
-      <w:proofErr w:type="spellEnd"/>
-      <w:r>
-        <w:t xml:space="preserve"> diagramma (</w:t>
-      </w:r>
-      <w:proofErr w:type="spellStart"/>
-      <w:r>
-        <w:t>Use</w:t>
-      </w:r>
-      <w:proofErr w:type="spellEnd"/>
-      <w:r>
-        <w:t xml:space="preserve"> </w:t>
-      </w:r>
-      <w:proofErr w:type="spellStart"/>
-      <w:r>
-        <w:t>Case</w:t>
-      </w:r>
-      <w:proofErr w:type="spellEnd"/>
-      <w:r>
-        <w:t>)</w:t>
+        <w:t>4.2.1. Lietojumgadījumu diagramma (Use Case)</w:t>
       </w:r>
       <w:bookmarkEnd w:id="17"/>
     </w:p>
@@ -11400,15 +10414,7 @@
       </w:pPr>
       <w:bookmarkStart w:id="18" w:name="_Toc212467045"/>
       <w:r>
-        <w:t>4.2.2. Aktivitāšu diagramma (</w:t>
-      </w:r>
-      <w:proofErr w:type="spellStart"/>
-      <w:r>
-        <w:t>Activity</w:t>
-      </w:r>
-      <w:proofErr w:type="spellEnd"/>
-      <w:r>
-        <w:t>)</w:t>
+        <w:t>4.2.2. Aktivitāšu diagramma (Activity)</w:t>
       </w:r>
       <w:bookmarkEnd w:id="18"/>
     </w:p>
@@ -11418,15 +10424,7 @@
       </w:pPr>
       <w:bookmarkStart w:id="19" w:name="_Toc212467046"/>
       <w:r>
-        <w:t>4.2.3. Stāvokļu diagramma (</w:t>
-      </w:r>
-      <w:proofErr w:type="spellStart"/>
-      <w:r>
-        <w:t>State</w:t>
-      </w:r>
-      <w:proofErr w:type="spellEnd"/>
-      <w:r>
-        <w:t>)</w:t>
+        <w:t>4.2.3. Stāvokļu diagramma (State)</w:t>
       </w:r>
       <w:bookmarkEnd w:id="19"/>
     </w:p>
@@ -11630,7 +10628,7 @@
 </file>
 
 <file path=word/endnotes.xml><?xml version="1.0" encoding="utf-8"?>
-<w:endnotes xmlns:wpc="http://schemas.microsoft.com/office/word/2010/wordprocessingCanvas" xmlns:cx="http://schemas.microsoft.com/office/drawing/2014/chartex" xmlns:cx1="http://schemas.microsoft.com/office/drawing/2015/9/8/chartex" xmlns:cx2="http://schemas.microsoft.com/office/drawing/2015/10/21/chartex" xmlns:cx3="http://schemas.microsoft.com/office/drawing/2016/5/9/chartex" xmlns:cx4="http://schemas.microsoft.com/office/drawing/2016/5/10/chartex" xmlns:cx5="http://schemas.microsoft.com/office/drawing/2016/5/11/chartex" xmlns:cx6="http://schemas.microsoft.com/office/drawing/2016/5/12/chartex" xmlns:cx7="http://schemas.microsoft.com/office/drawing/2016/5/13/chartex" xmlns:cx8="http://schemas.microsoft.com/office/drawing/2016/5/14/chartex" xmlns:mc="http://schemas.openxmlformats.org/markup-compatibility/2006" xmlns:aink="http://schemas.microsoft.com/office/drawing/2016/ink" xmlns:am3d="http://schemas.microsoft.com/office/drawing/2017/model3d" xmlns:o="urn:schemas-microsoft-com:office:office" xmlns:oel="http://schemas.microsoft.com/office/2019/extlst" xmlns:r="http://schemas.openxmlformats.org/officeDocument/2006/relationships" xmlns:m="http://schemas.openxmlformats.org/officeDocument/2006/math" xmlns:v="urn:schemas-microsoft-com:vml" xmlns:wp14="http://schemas.microsoft.com/office/word/2010/wordprocessingDrawing" xmlns:wp="http://schemas.openxmlformats.org/drawingml/2006/wordprocessingDrawing" xmlns:w10="urn:schemas-microsoft-com:office:word" xmlns:w="http://schemas.openxmlformats.org/wordprocessingml/2006/main" xmlns:w14="http://schemas.microsoft.com/office/word/2010/wordml" xmlns:w15="http://schemas.microsoft.com/office/word/2012/wordml" xmlns:w16cex="http://schemas.microsoft.com/office/word/2018/wordml/cex" xmlns:w16cid="http://schemas.microsoft.com/office/word/2016/wordml/cid" xmlns:w16="http://schemas.microsoft.com/office/word/2018/wordml" xmlns:w16sdtdh="http://schemas.microsoft.com/office/word/2020/wordml/sdtdatahash" xmlns:w16se="http://schemas.microsoft.com/office/word/2015/wordml/symex" xmlns:wpg="http://schemas.microsoft.com/office/word/2010/wordprocessingGroup" xmlns:wpi="http://schemas.microsoft.com/office/word/2010/wordprocessingInk" xmlns:wne="http://schemas.microsoft.com/office/word/2006/wordml" xmlns:wps="http://schemas.microsoft.com/office/word/2010/wordprocessingShape" mc:Ignorable="w14 w15 w16se w16cid w16 w16cex w16sdtdh wp14">
+<w:endnotes xmlns:wpc="http://schemas.microsoft.com/office/word/2010/wordprocessingCanvas" xmlns:cx="http://schemas.microsoft.com/office/drawing/2014/chartex" xmlns:cx1="http://schemas.microsoft.com/office/drawing/2015/9/8/chartex" xmlns:cx2="http://schemas.microsoft.com/office/drawing/2015/10/21/chartex" xmlns:cx3="http://schemas.microsoft.com/office/drawing/2016/5/9/chartex" xmlns:cx4="http://schemas.microsoft.com/office/drawing/2016/5/10/chartex" xmlns:cx5="http://schemas.microsoft.com/office/drawing/2016/5/11/chartex" xmlns:cx6="http://schemas.microsoft.com/office/drawing/2016/5/12/chartex" xmlns:cx7="http://schemas.microsoft.com/office/drawing/2016/5/13/chartex" xmlns:cx8="http://schemas.microsoft.com/office/drawing/2016/5/14/chartex" xmlns:mc="http://schemas.openxmlformats.org/markup-compatibility/2006" xmlns:aink="http://schemas.microsoft.com/office/drawing/2016/ink" xmlns:am3d="http://schemas.microsoft.com/office/drawing/2017/model3d" xmlns:o="urn:schemas-microsoft-com:office:office" xmlns:r="http://schemas.openxmlformats.org/officeDocument/2006/relationships" xmlns:m="http://schemas.openxmlformats.org/officeDocument/2006/math" xmlns:v="urn:schemas-microsoft-com:vml" xmlns:wp14="http://schemas.microsoft.com/office/word/2010/wordprocessingDrawing" xmlns:wp="http://schemas.openxmlformats.org/drawingml/2006/wordprocessingDrawing" xmlns:w10="urn:schemas-microsoft-com:office:word" xmlns:w="http://schemas.openxmlformats.org/wordprocessingml/2006/main" xmlns:w14="http://schemas.microsoft.com/office/word/2010/wordml" xmlns:w15="http://schemas.microsoft.com/office/word/2012/wordml" xmlns:w16cex="http://schemas.microsoft.com/office/word/2018/wordml/cex" xmlns:w16cid="http://schemas.microsoft.com/office/word/2016/wordml/cid" xmlns:w16="http://schemas.microsoft.com/office/word/2018/wordml" xmlns:w16sdtdh="http://schemas.microsoft.com/office/word/2020/wordml/sdtdatahash" xmlns:w16se="http://schemas.microsoft.com/office/word/2015/wordml/symex" xmlns:wpg="http://schemas.microsoft.com/office/word/2010/wordprocessingGroup" xmlns:wpi="http://schemas.microsoft.com/office/word/2010/wordprocessingInk" xmlns:wne="http://schemas.microsoft.com/office/word/2006/wordml" xmlns:wps="http://schemas.microsoft.com/office/word/2010/wordprocessingShape" mc:Ignorable="w14 w15 w16se w16cid w16 w16cex w16sdtdh wp14">
   <w:endnote w:type="separator" w:id="-1">
     <w:p>
       <w:r>
@@ -11649,14 +10647,14 @@
 </file>
 
 <file path=word/footer1.xml><?xml version="1.0" encoding="utf-8"?>
-<w:ftr xmlns:wpc="http://schemas.microsoft.com/office/word/2010/wordprocessingCanvas" xmlns:cx="http://schemas.microsoft.com/office/drawing/2014/chartex" xmlns:cx1="http://schemas.microsoft.com/office/drawing/2015/9/8/chartex" xmlns:cx2="http://schemas.microsoft.com/office/drawing/2015/10/21/chartex" xmlns:cx3="http://schemas.microsoft.com/office/drawing/2016/5/9/chartex" xmlns:cx4="http://schemas.microsoft.com/office/drawing/2016/5/10/chartex" xmlns:cx5="http://schemas.microsoft.com/office/drawing/2016/5/11/chartex" xmlns:cx6="http://schemas.microsoft.com/office/drawing/2016/5/12/chartex" xmlns:cx7="http://schemas.microsoft.com/office/drawing/2016/5/13/chartex" xmlns:cx8="http://schemas.microsoft.com/office/drawing/2016/5/14/chartex" xmlns:mc="http://schemas.openxmlformats.org/markup-compatibility/2006" xmlns:aink="http://schemas.microsoft.com/office/drawing/2016/ink" xmlns:am3d="http://schemas.microsoft.com/office/drawing/2017/model3d" xmlns:o="urn:schemas-microsoft-com:office:office" xmlns:oel="http://schemas.microsoft.com/office/2019/extlst" xmlns:r="http://schemas.openxmlformats.org/officeDocument/2006/relationships" xmlns:m="http://schemas.openxmlformats.org/officeDocument/2006/math" xmlns:v="urn:schemas-microsoft-com:vml" xmlns:wp14="http://schemas.microsoft.com/office/word/2010/wordprocessingDrawing" xmlns:wp="http://schemas.openxmlformats.org/drawingml/2006/wordprocessingDrawing" xmlns:w10="urn:schemas-microsoft-com:office:word" xmlns:w="http://schemas.openxmlformats.org/wordprocessingml/2006/main" xmlns:w14="http://schemas.microsoft.com/office/word/2010/wordml" xmlns:w15="http://schemas.microsoft.com/office/word/2012/wordml" xmlns:w16cex="http://schemas.microsoft.com/office/word/2018/wordml/cex" xmlns:w16cid="http://schemas.microsoft.com/office/word/2016/wordml/cid" xmlns:w16="http://schemas.microsoft.com/office/word/2018/wordml" xmlns:w16sdtdh="http://schemas.microsoft.com/office/word/2020/wordml/sdtdatahash" xmlns:w16se="http://schemas.microsoft.com/office/word/2015/wordml/symex" xmlns:wpg="http://schemas.microsoft.com/office/word/2010/wordprocessingGroup" xmlns:wpi="http://schemas.microsoft.com/office/word/2010/wordprocessingInk" xmlns:wne="http://schemas.microsoft.com/office/word/2006/wordml" xmlns:wps="http://schemas.microsoft.com/office/word/2010/wordprocessingShape" mc:Ignorable="w14 w15 w16se w16cid w16 w16cex w16sdtdh wp14">
+<w:ftr xmlns:wpc="http://schemas.microsoft.com/office/word/2010/wordprocessingCanvas" xmlns:cx="http://schemas.microsoft.com/office/drawing/2014/chartex" xmlns:cx1="http://schemas.microsoft.com/office/drawing/2015/9/8/chartex" xmlns:cx2="http://schemas.microsoft.com/office/drawing/2015/10/21/chartex" xmlns:cx3="http://schemas.microsoft.com/office/drawing/2016/5/9/chartex" xmlns:cx4="http://schemas.microsoft.com/office/drawing/2016/5/10/chartex" xmlns:cx5="http://schemas.microsoft.com/office/drawing/2016/5/11/chartex" xmlns:cx6="http://schemas.microsoft.com/office/drawing/2016/5/12/chartex" xmlns:cx7="http://schemas.microsoft.com/office/drawing/2016/5/13/chartex" xmlns:cx8="http://schemas.microsoft.com/office/drawing/2016/5/14/chartex" xmlns:mc="http://schemas.openxmlformats.org/markup-compatibility/2006" xmlns:aink="http://schemas.microsoft.com/office/drawing/2016/ink" xmlns:am3d="http://schemas.microsoft.com/office/drawing/2017/model3d" xmlns:o="urn:schemas-microsoft-com:office:office" xmlns:r="http://schemas.openxmlformats.org/officeDocument/2006/relationships" xmlns:m="http://schemas.openxmlformats.org/officeDocument/2006/math" xmlns:v="urn:schemas-microsoft-com:vml" xmlns:wp14="http://schemas.microsoft.com/office/word/2010/wordprocessingDrawing" xmlns:wp="http://schemas.openxmlformats.org/drawingml/2006/wordprocessingDrawing" xmlns:w10="urn:schemas-microsoft-com:office:word" xmlns:w="http://schemas.openxmlformats.org/wordprocessingml/2006/main" xmlns:w14="http://schemas.microsoft.com/office/word/2010/wordml" xmlns:w15="http://schemas.microsoft.com/office/word/2012/wordml" xmlns:w16cex="http://schemas.microsoft.com/office/word/2018/wordml/cex" xmlns:w16cid="http://schemas.microsoft.com/office/word/2016/wordml/cid" xmlns:w16="http://schemas.microsoft.com/office/word/2018/wordml" xmlns:w16sdtdh="http://schemas.microsoft.com/office/word/2020/wordml/sdtdatahash" xmlns:w16se="http://schemas.microsoft.com/office/word/2015/wordml/symex" xmlns:wpg="http://schemas.microsoft.com/office/word/2010/wordprocessingGroup" xmlns:wpi="http://schemas.microsoft.com/office/word/2010/wordprocessingInk" xmlns:wne="http://schemas.microsoft.com/office/word/2006/wordml" xmlns:wps="http://schemas.microsoft.com/office/word/2010/wordprocessingShape" mc:Ignorable="w14 w15 w16se w16cid w16 w16cex w16sdtdh wp14">
   <w:p/>
   <w:p/>
 </w:ftr>
 </file>
 
 <file path=word/footer2.xml><?xml version="1.0" encoding="utf-8"?>
-<w:ftr xmlns:wpc="http://schemas.microsoft.com/office/word/2010/wordprocessingCanvas" xmlns:cx="http://schemas.microsoft.com/office/drawing/2014/chartex" xmlns:cx1="http://schemas.microsoft.com/office/drawing/2015/9/8/chartex" xmlns:cx2="http://schemas.microsoft.com/office/drawing/2015/10/21/chartex" xmlns:cx3="http://schemas.microsoft.com/office/drawing/2016/5/9/chartex" xmlns:cx4="http://schemas.microsoft.com/office/drawing/2016/5/10/chartex" xmlns:cx5="http://schemas.microsoft.com/office/drawing/2016/5/11/chartex" xmlns:cx6="http://schemas.microsoft.com/office/drawing/2016/5/12/chartex" xmlns:cx7="http://schemas.microsoft.com/office/drawing/2016/5/13/chartex" xmlns:cx8="http://schemas.microsoft.com/office/drawing/2016/5/14/chartex" xmlns:mc="http://schemas.openxmlformats.org/markup-compatibility/2006" xmlns:aink="http://schemas.microsoft.com/office/drawing/2016/ink" xmlns:am3d="http://schemas.microsoft.com/office/drawing/2017/model3d" xmlns:o="urn:schemas-microsoft-com:office:office" xmlns:oel="http://schemas.microsoft.com/office/2019/extlst" xmlns:r="http://schemas.openxmlformats.org/officeDocument/2006/relationships" xmlns:m="http://schemas.openxmlformats.org/officeDocument/2006/math" xmlns:v="urn:schemas-microsoft-com:vml" xmlns:wp14="http://schemas.microsoft.com/office/word/2010/wordprocessingDrawing" xmlns:wp="http://schemas.openxmlformats.org/drawingml/2006/wordprocessingDrawing" xmlns:w10="urn:schemas-microsoft-com:office:word" xmlns:w="http://schemas.openxmlformats.org/wordprocessingml/2006/main" xmlns:w14="http://schemas.microsoft.com/office/word/2010/wordml" xmlns:w15="http://schemas.microsoft.com/office/word/2012/wordml" xmlns:w16cex="http://schemas.microsoft.com/office/word/2018/wordml/cex" xmlns:w16cid="http://schemas.microsoft.com/office/word/2016/wordml/cid" xmlns:w16="http://schemas.microsoft.com/office/word/2018/wordml" xmlns:w16sdtdh="http://schemas.microsoft.com/office/word/2020/wordml/sdtdatahash" xmlns:w16se="http://schemas.microsoft.com/office/word/2015/wordml/symex" xmlns:wpg="http://schemas.microsoft.com/office/word/2010/wordprocessingGroup" xmlns:wpi="http://schemas.microsoft.com/office/word/2010/wordprocessingInk" xmlns:wne="http://schemas.microsoft.com/office/word/2006/wordml" xmlns:wps="http://schemas.microsoft.com/office/word/2010/wordprocessingShape" mc:Ignorable="w14 w15 w16se w16cid w16 w16cex w16sdtdh wp14">
+<w:ftr xmlns:wpc="http://schemas.microsoft.com/office/word/2010/wordprocessingCanvas" xmlns:cx="http://schemas.microsoft.com/office/drawing/2014/chartex" xmlns:cx1="http://schemas.microsoft.com/office/drawing/2015/9/8/chartex" xmlns:cx2="http://schemas.microsoft.com/office/drawing/2015/10/21/chartex" xmlns:cx3="http://schemas.microsoft.com/office/drawing/2016/5/9/chartex" xmlns:cx4="http://schemas.microsoft.com/office/drawing/2016/5/10/chartex" xmlns:cx5="http://schemas.microsoft.com/office/drawing/2016/5/11/chartex" xmlns:cx6="http://schemas.microsoft.com/office/drawing/2016/5/12/chartex" xmlns:cx7="http://schemas.microsoft.com/office/drawing/2016/5/13/chartex" xmlns:cx8="http://schemas.microsoft.com/office/drawing/2016/5/14/chartex" xmlns:mc="http://schemas.openxmlformats.org/markup-compatibility/2006" xmlns:aink="http://schemas.microsoft.com/office/drawing/2016/ink" xmlns:am3d="http://schemas.microsoft.com/office/drawing/2017/model3d" xmlns:o="urn:schemas-microsoft-com:office:office" xmlns:r="http://schemas.openxmlformats.org/officeDocument/2006/relationships" xmlns:m="http://schemas.openxmlformats.org/officeDocument/2006/math" xmlns:v="urn:schemas-microsoft-com:vml" xmlns:wp14="http://schemas.microsoft.com/office/word/2010/wordprocessingDrawing" xmlns:wp="http://schemas.openxmlformats.org/drawingml/2006/wordprocessingDrawing" xmlns:w10="urn:schemas-microsoft-com:office:word" xmlns:w="http://schemas.openxmlformats.org/wordprocessingml/2006/main" xmlns:w14="http://schemas.microsoft.com/office/word/2010/wordml" xmlns:w15="http://schemas.microsoft.com/office/word/2012/wordml" xmlns:w16cex="http://schemas.microsoft.com/office/word/2018/wordml/cex" xmlns:w16cid="http://schemas.microsoft.com/office/word/2016/wordml/cid" xmlns:w16="http://schemas.microsoft.com/office/word/2018/wordml" xmlns:w16sdtdh="http://schemas.microsoft.com/office/word/2020/wordml/sdtdatahash" xmlns:w16se="http://schemas.microsoft.com/office/word/2015/wordml/symex" xmlns:wpg="http://schemas.microsoft.com/office/word/2010/wordprocessingGroup" xmlns:wpi="http://schemas.microsoft.com/office/word/2010/wordprocessingInk" xmlns:wne="http://schemas.microsoft.com/office/word/2006/wordml" xmlns:wps="http://schemas.microsoft.com/office/word/2010/wordprocessingShape" mc:Ignorable="w14 w15 w16se w16cid w16 w16cex w16sdtdh wp14">
   <w:p>
     <w:pPr>
       <w:jc w:val="center"/>
@@ -11685,7 +10683,7 @@
 </file>
 
 <file path=word/footnotes.xml><?xml version="1.0" encoding="utf-8"?>
-<w:footnotes xmlns:wpc="http://schemas.microsoft.com/office/word/2010/wordprocessingCanvas" xmlns:cx="http://schemas.microsoft.com/office/drawing/2014/chartex" xmlns:cx1="http://schemas.microsoft.com/office/drawing/2015/9/8/chartex" xmlns:cx2="http://schemas.microsoft.com/office/drawing/2015/10/21/chartex" xmlns:cx3="http://schemas.microsoft.com/office/drawing/2016/5/9/chartex" xmlns:cx4="http://schemas.microsoft.com/office/drawing/2016/5/10/chartex" xmlns:cx5="http://schemas.microsoft.com/office/drawing/2016/5/11/chartex" xmlns:cx6="http://schemas.microsoft.com/office/drawing/2016/5/12/chartex" xmlns:cx7="http://schemas.microsoft.com/office/drawing/2016/5/13/chartex" xmlns:cx8="http://schemas.microsoft.com/office/drawing/2016/5/14/chartex" xmlns:mc="http://schemas.openxmlformats.org/markup-compatibility/2006" xmlns:aink="http://schemas.microsoft.com/office/drawing/2016/ink" xmlns:am3d="http://schemas.microsoft.com/office/drawing/2017/model3d" xmlns:o="urn:schemas-microsoft-com:office:office" xmlns:oel="http://schemas.microsoft.com/office/2019/extlst" xmlns:r="http://schemas.openxmlformats.org/officeDocument/2006/relationships" xmlns:m="http://schemas.openxmlformats.org/officeDocument/2006/math" xmlns:v="urn:schemas-microsoft-com:vml" xmlns:wp14="http://schemas.microsoft.com/office/word/2010/wordprocessingDrawing" xmlns:wp="http://schemas.openxmlformats.org/drawingml/2006/wordprocessingDrawing" xmlns:w10="urn:schemas-microsoft-com:office:word" xmlns:w="http://schemas.openxmlformats.org/wordprocessingml/2006/main" xmlns:w14="http://schemas.microsoft.com/office/word/2010/wordml" xmlns:w15="http://schemas.microsoft.com/office/word/2012/wordml" xmlns:w16cex="http://schemas.microsoft.com/office/word/2018/wordml/cex" xmlns:w16cid="http://schemas.microsoft.com/office/word/2016/wordml/cid" xmlns:w16="http://schemas.microsoft.com/office/word/2018/wordml" xmlns:w16sdtdh="http://schemas.microsoft.com/office/word/2020/wordml/sdtdatahash" xmlns:w16se="http://schemas.microsoft.com/office/word/2015/wordml/symex" xmlns:wpg="http://schemas.microsoft.com/office/word/2010/wordprocessingGroup" xmlns:wpi="http://schemas.microsoft.com/office/word/2010/wordprocessingInk" xmlns:wne="http://schemas.microsoft.com/office/word/2006/wordml" xmlns:wps="http://schemas.microsoft.com/office/word/2010/wordprocessingShape" mc:Ignorable="w14 w15 w16se w16cid w16 w16cex w16sdtdh wp14">
+<w:footnotes xmlns:wpc="http://schemas.microsoft.com/office/word/2010/wordprocessingCanvas" xmlns:cx="http://schemas.microsoft.com/office/drawing/2014/chartex" xmlns:cx1="http://schemas.microsoft.com/office/drawing/2015/9/8/chartex" xmlns:cx2="http://schemas.microsoft.com/office/drawing/2015/10/21/chartex" xmlns:cx3="http://schemas.microsoft.com/office/drawing/2016/5/9/chartex" xmlns:cx4="http://schemas.microsoft.com/office/drawing/2016/5/10/chartex" xmlns:cx5="http://schemas.microsoft.com/office/drawing/2016/5/11/chartex" xmlns:cx6="http://schemas.microsoft.com/office/drawing/2016/5/12/chartex" xmlns:cx7="http://schemas.microsoft.com/office/drawing/2016/5/13/chartex" xmlns:cx8="http://schemas.microsoft.com/office/drawing/2016/5/14/chartex" xmlns:mc="http://schemas.openxmlformats.org/markup-compatibility/2006" xmlns:aink="http://schemas.microsoft.com/office/drawing/2016/ink" xmlns:am3d="http://schemas.microsoft.com/office/drawing/2017/model3d" xmlns:o="urn:schemas-microsoft-com:office:office" xmlns:r="http://schemas.openxmlformats.org/officeDocument/2006/relationships" xmlns:m="http://schemas.openxmlformats.org/officeDocument/2006/math" xmlns:v="urn:schemas-microsoft-com:vml" xmlns:wp14="http://schemas.microsoft.com/office/word/2010/wordprocessingDrawing" xmlns:wp="http://schemas.openxmlformats.org/drawingml/2006/wordprocessingDrawing" xmlns:w10="urn:schemas-microsoft-com:office:word" xmlns:w="http://schemas.openxmlformats.org/wordprocessingml/2006/main" xmlns:w14="http://schemas.microsoft.com/office/word/2010/wordml" xmlns:w15="http://schemas.microsoft.com/office/word/2012/wordml" xmlns:w16cex="http://schemas.microsoft.com/office/word/2018/wordml/cex" xmlns:w16cid="http://schemas.microsoft.com/office/word/2016/wordml/cid" xmlns:w16="http://schemas.microsoft.com/office/word/2018/wordml" xmlns:w16sdtdh="http://schemas.microsoft.com/office/word/2020/wordml/sdtdatahash" xmlns:w16se="http://schemas.microsoft.com/office/word/2015/wordml/symex" xmlns:wpg="http://schemas.microsoft.com/office/word/2010/wordprocessingGroup" xmlns:wpi="http://schemas.microsoft.com/office/word/2010/wordprocessingInk" xmlns:wne="http://schemas.microsoft.com/office/word/2006/wordml" xmlns:wps="http://schemas.microsoft.com/office/word/2010/wordprocessingShape" mc:Ignorable="w14 w15 w16se w16cid w16 w16cex w16sdtdh wp14">
   <w:footnote w:type="separator" w:id="-1">
     <w:p>
       <w:r>
@@ -11704,7 +10702,7 @@
 </file>
 
 <file path=word/numbering.xml><?xml version="1.0" encoding="utf-8"?>
-<w:numbering xmlns:wpc="http://schemas.microsoft.com/office/word/2010/wordprocessingCanvas" xmlns:cx="http://schemas.microsoft.com/office/drawing/2014/chartex" xmlns:cx1="http://schemas.microsoft.com/office/drawing/2015/9/8/chartex" xmlns:cx2="http://schemas.microsoft.com/office/drawing/2015/10/21/chartex" xmlns:cx3="http://schemas.microsoft.com/office/drawing/2016/5/9/chartex" xmlns:cx4="http://schemas.microsoft.com/office/drawing/2016/5/10/chartex" xmlns:cx5="http://schemas.microsoft.com/office/drawing/2016/5/11/chartex" xmlns:cx6="http://schemas.microsoft.com/office/drawing/2016/5/12/chartex" xmlns:cx7="http://schemas.microsoft.com/office/drawing/2016/5/13/chartex" xmlns:cx8="http://schemas.microsoft.com/office/drawing/2016/5/14/chartex" xmlns:mc="http://schemas.openxmlformats.org/markup-compatibility/2006" xmlns:aink="http://schemas.microsoft.com/office/drawing/2016/ink" xmlns:am3d="http://schemas.microsoft.com/office/drawing/2017/model3d" xmlns:o="urn:schemas-microsoft-com:office:office" xmlns:oel="http://schemas.microsoft.com/office/2019/extlst" xmlns:r="http://schemas.openxmlformats.org/officeDocument/2006/relationships" xmlns:m="http://schemas.openxmlformats.org/officeDocument/2006/math" xmlns:v="urn:schemas-microsoft-com:vml" xmlns:wp14="http://schemas.microsoft.com/office/word/2010/wordprocessingDrawing" xmlns:wp="http://schemas.openxmlformats.org/drawingml/2006/wordprocessingDrawing" xmlns:w10="urn:schemas-microsoft-com:office:word" xmlns:w="http://schemas.openxmlformats.org/wordprocessingml/2006/main" xmlns:w14="http://schemas.microsoft.com/office/word/2010/wordml" xmlns:w15="http://schemas.microsoft.com/office/word/2012/wordml" xmlns:w16cex="http://schemas.microsoft.com/office/word/2018/wordml/cex" xmlns:w16cid="http://schemas.microsoft.com/office/word/2016/wordml/cid" xmlns:w16="http://schemas.microsoft.com/office/word/2018/wordml" xmlns:w16sdtdh="http://schemas.microsoft.com/office/word/2020/wordml/sdtdatahash" xmlns:w16se="http://schemas.microsoft.com/office/word/2015/wordml/symex" xmlns:wpg="http://schemas.microsoft.com/office/word/2010/wordprocessingGroup" xmlns:wpi="http://schemas.microsoft.com/office/word/2010/wordprocessingInk" xmlns:wne="http://schemas.microsoft.com/office/word/2006/wordml" xmlns:wps="http://schemas.microsoft.com/office/word/2010/wordprocessingShape" mc:Ignorable="w14 w15 w16se w16cid w16 w16cex w16sdtdh wp14">
+<w:numbering xmlns:wpc="http://schemas.microsoft.com/office/word/2010/wordprocessingCanvas" xmlns:cx="http://schemas.microsoft.com/office/drawing/2014/chartex" xmlns:cx1="http://schemas.microsoft.com/office/drawing/2015/9/8/chartex" xmlns:cx2="http://schemas.microsoft.com/office/drawing/2015/10/21/chartex" xmlns:cx3="http://schemas.microsoft.com/office/drawing/2016/5/9/chartex" xmlns:cx4="http://schemas.microsoft.com/office/drawing/2016/5/10/chartex" xmlns:cx5="http://schemas.microsoft.com/office/drawing/2016/5/11/chartex" xmlns:cx6="http://schemas.microsoft.com/office/drawing/2016/5/12/chartex" xmlns:cx7="http://schemas.microsoft.com/office/drawing/2016/5/13/chartex" xmlns:cx8="http://schemas.microsoft.com/office/drawing/2016/5/14/chartex" xmlns:mc="http://schemas.openxmlformats.org/markup-compatibility/2006" xmlns:aink="http://schemas.microsoft.com/office/drawing/2016/ink" xmlns:am3d="http://schemas.microsoft.com/office/drawing/2017/model3d" xmlns:o="urn:schemas-microsoft-com:office:office" xmlns:r="http://schemas.openxmlformats.org/officeDocument/2006/relationships" xmlns:m="http://schemas.openxmlformats.org/officeDocument/2006/math" xmlns:v="urn:schemas-microsoft-com:vml" xmlns:wp14="http://schemas.microsoft.com/office/word/2010/wordprocessingDrawing" xmlns:wp="http://schemas.openxmlformats.org/drawingml/2006/wordprocessingDrawing" xmlns:w10="urn:schemas-microsoft-com:office:word" xmlns:w="http://schemas.openxmlformats.org/wordprocessingml/2006/main" xmlns:w14="http://schemas.microsoft.com/office/word/2010/wordml" xmlns:w15="http://schemas.microsoft.com/office/word/2012/wordml" xmlns:w16cex="http://schemas.microsoft.com/office/word/2018/wordml/cex" xmlns:w16cid="http://schemas.microsoft.com/office/word/2016/wordml/cid" xmlns:w16="http://schemas.microsoft.com/office/word/2018/wordml" xmlns:w16sdtdh="http://schemas.microsoft.com/office/word/2020/wordml/sdtdatahash" xmlns:w16se="http://schemas.microsoft.com/office/word/2015/wordml/symex" xmlns:wpg="http://schemas.microsoft.com/office/word/2010/wordprocessingGroup" xmlns:wpi="http://schemas.microsoft.com/office/word/2010/wordprocessingInk" xmlns:wne="http://schemas.microsoft.com/office/word/2006/wordml" xmlns:wps="http://schemas.microsoft.com/office/word/2010/wordprocessingShape" mc:Ignorable="w14 w15 w16se w16cid w16 w16cex w16sdtdh wp14">
   <w:abstractNum w:abstractNumId="0" w15:restartNumberingAfterBreak="0">
     <w:nsid w:val="067974B2"/>
     <w:multiLevelType w:val="hybridMultilevel"/>
@@ -15098,106 +14096,106 @@
       </w:pPr>
     </w:lvl>
   </w:abstractNum>
-  <w:num w:numId="1" w16cid:durableId="2083595319">
+  <w:num w:numId="1">
     <w:abstractNumId w:val="17"/>
   </w:num>
-  <w:num w:numId="2" w16cid:durableId="128324145">
+  <w:num w:numId="2">
     <w:abstractNumId w:val="16"/>
   </w:num>
-  <w:num w:numId="3" w16cid:durableId="447360407">
+  <w:num w:numId="3">
     <w:abstractNumId w:val="14"/>
   </w:num>
-  <w:num w:numId="4" w16cid:durableId="1120607215">
+  <w:num w:numId="4">
     <w:abstractNumId w:val="26"/>
   </w:num>
-  <w:num w:numId="5" w16cid:durableId="1388333373">
+  <w:num w:numId="5">
     <w:abstractNumId w:val="10"/>
   </w:num>
-  <w:num w:numId="6" w16cid:durableId="2005811789">
+  <w:num w:numId="6">
     <w:abstractNumId w:val="30"/>
   </w:num>
-  <w:num w:numId="7" w16cid:durableId="1803111393">
+  <w:num w:numId="7">
     <w:abstractNumId w:val="1"/>
   </w:num>
-  <w:num w:numId="8" w16cid:durableId="209653053">
+  <w:num w:numId="8">
     <w:abstractNumId w:val="32"/>
   </w:num>
-  <w:num w:numId="9" w16cid:durableId="1479303279">
+  <w:num w:numId="9">
     <w:abstractNumId w:val="21"/>
   </w:num>
-  <w:num w:numId="10" w16cid:durableId="162018414">
+  <w:num w:numId="10">
     <w:abstractNumId w:val="22"/>
   </w:num>
-  <w:num w:numId="11" w16cid:durableId="1887058649">
+  <w:num w:numId="11">
     <w:abstractNumId w:val="23"/>
   </w:num>
-  <w:num w:numId="12" w16cid:durableId="707951939">
+  <w:num w:numId="12">
     <w:abstractNumId w:val="33"/>
   </w:num>
-  <w:num w:numId="13" w16cid:durableId="1701781458">
+  <w:num w:numId="13">
     <w:abstractNumId w:val="0"/>
   </w:num>
-  <w:num w:numId="14" w16cid:durableId="205989579">
+  <w:num w:numId="14">
     <w:abstractNumId w:val="5"/>
   </w:num>
-  <w:num w:numId="15" w16cid:durableId="708997075">
+  <w:num w:numId="15">
     <w:abstractNumId w:val="11"/>
   </w:num>
-  <w:num w:numId="16" w16cid:durableId="134446296">
+  <w:num w:numId="16">
     <w:abstractNumId w:val="6"/>
   </w:num>
-  <w:num w:numId="17" w16cid:durableId="1582179520">
+  <w:num w:numId="17">
     <w:abstractNumId w:val="8"/>
   </w:num>
-  <w:num w:numId="18" w16cid:durableId="1697851693">
+  <w:num w:numId="18">
     <w:abstractNumId w:val="28"/>
   </w:num>
-  <w:num w:numId="19" w16cid:durableId="1404109690">
+  <w:num w:numId="19">
     <w:abstractNumId w:val="15"/>
   </w:num>
-  <w:num w:numId="20" w16cid:durableId="1510021205">
+  <w:num w:numId="20">
     <w:abstractNumId w:val="19"/>
   </w:num>
-  <w:num w:numId="21" w16cid:durableId="1986201990">
+  <w:num w:numId="21">
     <w:abstractNumId w:val="31"/>
   </w:num>
-  <w:num w:numId="22" w16cid:durableId="1658224180">
+  <w:num w:numId="22">
     <w:abstractNumId w:val="12"/>
   </w:num>
-  <w:num w:numId="23" w16cid:durableId="1432165797">
+  <w:num w:numId="23">
     <w:abstractNumId w:val="27"/>
   </w:num>
-  <w:num w:numId="24" w16cid:durableId="78983991">
+  <w:num w:numId="24">
     <w:abstractNumId w:val="9"/>
   </w:num>
-  <w:num w:numId="25" w16cid:durableId="900138023">
+  <w:num w:numId="25">
     <w:abstractNumId w:val="2"/>
   </w:num>
-  <w:num w:numId="26" w16cid:durableId="1350986733">
+  <w:num w:numId="26">
     <w:abstractNumId w:val="13"/>
   </w:num>
-  <w:num w:numId="27" w16cid:durableId="1864173124">
+  <w:num w:numId="27">
     <w:abstractNumId w:val="3"/>
   </w:num>
-  <w:num w:numId="28" w16cid:durableId="619263263">
+  <w:num w:numId="28">
     <w:abstractNumId w:val="7"/>
   </w:num>
-  <w:num w:numId="29" w16cid:durableId="597952265">
+  <w:num w:numId="29">
     <w:abstractNumId w:val="4"/>
   </w:num>
-  <w:num w:numId="30" w16cid:durableId="1848322382">
+  <w:num w:numId="30">
     <w:abstractNumId w:val="24"/>
   </w:num>
-  <w:num w:numId="31" w16cid:durableId="1851337411">
+  <w:num w:numId="31">
     <w:abstractNumId w:val="18"/>
   </w:num>
-  <w:num w:numId="32" w16cid:durableId="525480347">
+  <w:num w:numId="32">
     <w:abstractNumId w:val="25"/>
   </w:num>
-  <w:num w:numId="33" w16cid:durableId="194663908">
+  <w:num w:numId="33">
     <w:abstractNumId w:val="29"/>
   </w:num>
-  <w:num w:numId="34" w16cid:durableId="1302659393">
+  <w:num w:numId="34">
     <w:abstractNumId w:val="20"/>
   </w:num>
 </w:numbering>

</xml_diff>